<commit_message>
Implement forwarding unit and tests
</commit_message>
<xml_diff>
--- a/Pipeline_Processor_Report.docx
+++ b/Pipeline_Processor_Report.docx
@@ -137,12 +137,15 @@
         </w:rPr>
       </w:pPr>
     </w:p>
-    <w:p/>
+    <w:p>
+      <w:pPr>
+        <w:jc w:val="right"/>
+      </w:pPr>
+    </w:p>
     <w:p>
       <w:pPr>
         <w:pStyle w:val="Heading1"/>
         <w:bidi/>
-        <w:jc w:val="right"/>
       </w:pPr>
       <w:r>
         <w:rPr>
@@ -155,7 +158,6 @@
     <w:p>
       <w:pPr>
         <w:bidi/>
-        <w:jc w:val="right"/>
       </w:pPr>
       <w:r>
         <w:rPr>
@@ -167,7 +169,6 @@
     <w:p>
       <w:pPr>
         <w:bidi/>
-        <w:jc w:val="right"/>
       </w:pPr>
       <w:r>
         <w:rPr>
@@ -179,7 +180,6 @@
     <w:p>
       <w:pPr>
         <w:bidi/>
-        <w:jc w:val="right"/>
       </w:pPr>
       <w:r>
         <w:rPr>
@@ -191,7 +191,6 @@
     <w:p>
       <w:pPr>
         <w:bidi/>
-        <w:jc w:val="right"/>
       </w:pPr>
       <w:r>
         <w:rPr>
@@ -203,7 +202,6 @@
     <w:p>
       <w:pPr>
         <w:bidi/>
-        <w:jc w:val="right"/>
       </w:pPr>
       <w:r>
         <w:rPr>
@@ -215,7 +213,6 @@
     <w:p>
       <w:pPr>
         <w:bidi/>
-        <w:jc w:val="right"/>
       </w:pPr>
       <w:r>
         <w:rPr>
@@ -227,7 +224,6 @@
     <w:p>
       <w:pPr>
         <w:bidi/>
-        <w:jc w:val="right"/>
       </w:pPr>
       <w:r>
         <w:rPr>
@@ -240,7 +236,6 @@
       <w:pPr>
         <w:pStyle w:val="Heading1"/>
         <w:bidi/>
-        <w:jc w:val="right"/>
       </w:pPr>
       <w:r>
         <w:rPr>
@@ -253,7 +248,6 @@
     <w:p>
       <w:pPr>
         <w:bidi/>
-        <w:jc w:val="right"/>
       </w:pPr>
       <w:r>
         <w:rPr>
@@ -343,7 +337,7 @@
           <w:p>
             <w:pPr>
               <w:bidi/>
-              <w:jc w:val="right"/>
+              <w:jc w:val="center"/>
               <w:cnfStyle w:val="000000100000" w:firstRow="0" w:lastRow="0" w:firstColumn="0" w:lastColumn="0" w:oddVBand="0" w:evenVBand="0" w:oddHBand="1" w:evenHBand="0" w:firstRowFirstColumn="0" w:firstRowLastColumn="0" w:lastRowFirstColumn="0" w:lastRowLastColumn="0"/>
             </w:pPr>
             <w:r>
@@ -381,7 +375,7 @@
           <w:p>
             <w:pPr>
               <w:bidi/>
-              <w:jc w:val="right"/>
+              <w:jc w:val="center"/>
               <w:cnfStyle w:val="000000000000" w:firstRow="0" w:lastRow="0" w:firstColumn="0" w:lastColumn="0" w:oddVBand="0" w:evenVBand="0" w:oddHBand="0" w:evenHBand="0" w:firstRowFirstColumn="0" w:firstRowLastColumn="0" w:lastRowFirstColumn="0" w:lastRowLastColumn="0"/>
             </w:pPr>
             <w:r>
@@ -422,7 +416,7 @@
           <w:p>
             <w:pPr>
               <w:bidi/>
-              <w:jc w:val="right"/>
+              <w:jc w:val="center"/>
               <w:cnfStyle w:val="000000100000" w:firstRow="0" w:lastRow="0" w:firstColumn="0" w:lastColumn="0" w:oddVBand="0" w:evenVBand="0" w:oddHBand="1" w:evenHBand="0" w:firstRowFirstColumn="0" w:firstRowLastColumn="0" w:lastRowFirstColumn="0" w:lastRowLastColumn="0"/>
             </w:pPr>
             <w:r>
@@ -439,7 +433,6 @@
       <w:pPr>
         <w:pStyle w:val="Heading2"/>
         <w:bidi/>
-        <w:jc w:val="right"/>
       </w:pPr>
       <w:r>
         <w:rPr>
@@ -452,7 +445,6 @@
     <w:p>
       <w:pPr>
         <w:bidi/>
-        <w:jc w:val="right"/>
       </w:pPr>
       <w:r>
         <w:rPr>
@@ -464,7 +456,6 @@
     <w:p>
       <w:pPr>
         <w:bidi/>
-        <w:jc w:val="right"/>
       </w:pPr>
       <w:r>
         <w:rPr>
@@ -476,7 +467,6 @@
     <w:p>
       <w:pPr>
         <w:bidi/>
-        <w:jc w:val="right"/>
       </w:pPr>
       <w:r>
         <w:rPr>
@@ -488,7 +478,6 @@
     <w:p>
       <w:pPr>
         <w:bidi/>
-        <w:jc w:val="right"/>
       </w:pPr>
       <w:r>
         <w:rPr>
@@ -591,7 +580,6 @@
           <w:p>
             <w:pPr>
               <w:bidi/>
-              <w:jc w:val="right"/>
               <w:cnfStyle w:val="000000100000" w:firstRow="0" w:lastRow="0" w:firstColumn="0" w:lastColumn="0" w:oddVBand="0" w:evenVBand="0" w:oddHBand="1" w:evenHBand="0" w:firstRowFirstColumn="0" w:firstRowLastColumn="0" w:lastRowFirstColumn="0" w:lastRowLastColumn="0"/>
             </w:pPr>
             <w:r>
@@ -629,7 +617,6 @@
           <w:p>
             <w:pPr>
               <w:bidi/>
-              <w:jc w:val="right"/>
               <w:cnfStyle w:val="000000000000" w:firstRow="0" w:lastRow="0" w:firstColumn="0" w:lastColumn="0" w:oddVBand="0" w:evenVBand="0" w:oddHBand="0" w:evenHBand="0" w:firstRowFirstColumn="0" w:firstRowLastColumn="0" w:lastRowFirstColumn="0" w:lastRowLastColumn="0"/>
             </w:pPr>
             <w:r>
@@ -670,7 +657,6 @@
           <w:p>
             <w:pPr>
               <w:bidi/>
-              <w:jc w:val="right"/>
               <w:cnfStyle w:val="000000100000" w:firstRow="0" w:lastRow="0" w:firstColumn="0" w:lastColumn="0" w:oddVBand="0" w:evenVBand="0" w:oddHBand="1" w:evenHBand="0" w:firstRowFirstColumn="0" w:firstRowLastColumn="0" w:lastRowFirstColumn="0" w:lastRowLastColumn="0"/>
             </w:pPr>
             <w:r>
@@ -708,7 +694,6 @@
           <w:p>
             <w:pPr>
               <w:bidi/>
-              <w:jc w:val="right"/>
               <w:cnfStyle w:val="000000000000" w:firstRow="0" w:lastRow="0" w:firstColumn="0" w:lastColumn="0" w:oddVBand="0" w:evenVBand="0" w:oddHBand="0" w:evenHBand="0" w:firstRowFirstColumn="0" w:firstRowLastColumn="0" w:lastRowFirstColumn="0" w:lastRowLastColumn="0"/>
             </w:pPr>
             <w:r>
@@ -749,7 +734,6 @@
           <w:p>
             <w:pPr>
               <w:bidi/>
-              <w:jc w:val="right"/>
               <w:cnfStyle w:val="000000100000" w:firstRow="0" w:lastRow="0" w:firstColumn="0" w:lastColumn="0" w:oddVBand="0" w:evenVBand="0" w:oddHBand="1" w:evenHBand="0" w:firstRowFirstColumn="0" w:firstRowLastColumn="0" w:lastRowFirstColumn="0" w:lastRowLastColumn="0"/>
             </w:pPr>
             <w:r>
@@ -787,7 +771,6 @@
           <w:p>
             <w:pPr>
               <w:bidi/>
-              <w:jc w:val="right"/>
               <w:cnfStyle w:val="000000000000" w:firstRow="0" w:lastRow="0" w:firstColumn="0" w:lastColumn="0" w:oddVBand="0" w:evenVBand="0" w:oddHBand="0" w:evenHBand="0" w:firstRowFirstColumn="0" w:firstRowLastColumn="0" w:lastRowFirstColumn="0" w:lastRowLastColumn="0"/>
             </w:pPr>
             <w:r>
@@ -803,7 +786,6 @@
     <w:p>
       <w:pPr>
         <w:bidi/>
-        <w:jc w:val="right"/>
       </w:pPr>
       <w:r>
         <w:rPr>
@@ -817,7 +799,6 @@
       <w:pPr>
         <w:pStyle w:val="Heading2"/>
         <w:bidi/>
-        <w:jc w:val="right"/>
       </w:pPr>
       <w:r>
         <w:rPr>
@@ -831,7 +812,6 @@
     <w:p>
       <w:pPr>
         <w:bidi/>
-        <w:jc w:val="right"/>
       </w:pPr>
       <w:r>
         <w:rPr>
@@ -843,7 +823,6 @@
     <w:p>
       <w:pPr>
         <w:bidi/>
-        <w:jc w:val="right"/>
       </w:pPr>
       <w:r>
         <w:rPr>
@@ -855,7 +834,6 @@
     <w:p>
       <w:pPr>
         <w:bidi/>
-        <w:jc w:val="right"/>
       </w:pPr>
       <w:r>
         <w:rPr>
@@ -867,7 +845,6 @@
     <w:p>
       <w:pPr>
         <w:bidi/>
-        <w:jc w:val="right"/>
       </w:pPr>
       <w:r>
         <w:rPr>
@@ -879,7 +856,6 @@
     <w:p>
       <w:pPr>
         <w:bidi/>
-        <w:jc w:val="right"/>
       </w:pPr>
       <w:r>
         <w:rPr>
@@ -891,7 +867,6 @@
     <w:p>
       <w:pPr>
         <w:bidi/>
-        <w:jc w:val="right"/>
       </w:pPr>
       <w:r>
         <w:rPr>
@@ -903,7 +878,6 @@
     <w:p>
       <w:pPr>
         <w:bidi/>
-        <w:jc w:val="right"/>
       </w:pPr>
       <w:r>
         <w:rPr>
@@ -917,7 +891,6 @@
       <w:pPr>
         <w:pStyle w:val="Heading1"/>
         <w:bidi/>
-        <w:jc w:val="right"/>
       </w:pPr>
       <w:r>
         <w:rPr>
@@ -930,7 +903,6 @@
     <w:p>
       <w:pPr>
         <w:bidi/>
-        <w:jc w:val="right"/>
       </w:pPr>
       <w:r>
         <w:rPr>
@@ -942,7 +914,6 @@
     <w:p>
       <w:pPr>
         <w:bidi/>
-        <w:jc w:val="right"/>
       </w:pPr>
       <w:r>
         <w:rPr>
@@ -954,7 +925,6 @@
     <w:p>
       <w:pPr>
         <w:bidi/>
-        <w:jc w:val="right"/>
       </w:pPr>
       <w:r>
         <w:rPr>
@@ -966,7 +936,6 @@
     <w:p>
       <w:pPr>
         <w:bidi/>
-        <w:jc w:val="right"/>
       </w:pPr>
       <w:r>
         <w:rPr>
@@ -978,7 +947,6 @@
     <w:p>
       <w:pPr>
         <w:bidi/>
-        <w:jc w:val="right"/>
       </w:pPr>
       <w:r>
         <w:rPr>
@@ -990,7 +958,6 @@
     <w:p>
       <w:pPr>
         <w:bidi/>
-        <w:jc w:val="right"/>
       </w:pPr>
       <w:r>
         <w:rPr>
@@ -1002,7 +969,6 @@
     <w:p>
       <w:pPr>
         <w:bidi/>
-        <w:jc w:val="right"/>
       </w:pPr>
       <w:r>
         <w:rPr>
@@ -1014,7 +980,6 @@
     <w:p>
       <w:pPr>
         <w:bidi/>
-        <w:jc w:val="right"/>
       </w:pPr>
       <w:r>
         <w:rPr>
@@ -1026,7 +991,6 @@
     <w:p>
       <w:pPr>
         <w:bidi/>
-        <w:jc w:val="right"/>
       </w:pPr>
       <w:r>
         <w:rPr>
@@ -1038,7 +1002,6 @@
     <w:p>
       <w:pPr>
         <w:bidi/>
-        <w:jc w:val="right"/>
       </w:pPr>
       <w:r>
         <w:rPr>
@@ -1050,7 +1013,6 @@
     <w:p>
       <w:pPr>
         <w:bidi/>
-        <w:jc w:val="right"/>
       </w:pPr>
       <w:r>
         <w:rPr>
@@ -1063,7 +1025,6 @@
       <w:pPr>
         <w:pStyle w:val="Heading1"/>
         <w:bidi/>
-        <w:jc w:val="right"/>
       </w:pPr>
       <w:r>
         <w:rPr>
@@ -1077,7 +1038,6 @@
     <w:p>
       <w:pPr>
         <w:bidi/>
-        <w:jc w:val="right"/>
       </w:pPr>
       <w:r>
         <w:rPr>
@@ -1166,7 +1126,7 @@
           <w:p>
             <w:pPr>
               <w:bidi/>
-              <w:jc w:val="right"/>
+              <w:jc w:val="center"/>
               <w:cnfStyle w:val="000000100000" w:firstRow="0" w:lastRow="0" w:firstColumn="0" w:lastColumn="0" w:oddVBand="0" w:evenVBand="0" w:oddHBand="1" w:evenHBand="0" w:firstRowFirstColumn="0" w:firstRowLastColumn="0" w:lastRowFirstColumn="0" w:lastRowLastColumn="0"/>
             </w:pPr>
             <w:r>
@@ -1204,7 +1164,7 @@
           <w:p>
             <w:pPr>
               <w:bidi/>
-              <w:jc w:val="right"/>
+              <w:jc w:val="center"/>
               <w:cnfStyle w:val="000000000000" w:firstRow="0" w:lastRow="0" w:firstColumn="0" w:lastColumn="0" w:oddVBand="0" w:evenVBand="0" w:oddHBand="0" w:evenHBand="0" w:firstRowFirstColumn="0" w:firstRowLastColumn="0" w:lastRowFirstColumn="0" w:lastRowLastColumn="0"/>
             </w:pPr>
             <w:r>
@@ -1245,7 +1205,7 @@
           <w:p>
             <w:pPr>
               <w:bidi/>
-              <w:jc w:val="right"/>
+              <w:jc w:val="center"/>
               <w:cnfStyle w:val="000000100000" w:firstRow="0" w:lastRow="0" w:firstColumn="0" w:lastColumn="0" w:oddVBand="0" w:evenVBand="0" w:oddHBand="1" w:evenHBand="0" w:firstRowFirstColumn="0" w:firstRowLastColumn="0" w:lastRowFirstColumn="0" w:lastRowLastColumn="0"/>
             </w:pPr>
             <w:r>
@@ -1283,7 +1243,7 @@
           <w:p>
             <w:pPr>
               <w:bidi/>
-              <w:jc w:val="right"/>
+              <w:jc w:val="center"/>
               <w:cnfStyle w:val="000000000000" w:firstRow="0" w:lastRow="0" w:firstColumn="0" w:lastColumn="0" w:oddVBand="0" w:evenVBand="0" w:oddHBand="0" w:evenHBand="0" w:firstRowFirstColumn="0" w:firstRowLastColumn="0" w:lastRowFirstColumn="0" w:lastRowLastColumn="0"/>
             </w:pPr>
             <w:r>
@@ -1324,7 +1284,7 @@
           <w:p>
             <w:pPr>
               <w:bidi/>
-              <w:jc w:val="right"/>
+              <w:jc w:val="center"/>
               <w:cnfStyle w:val="000000100000" w:firstRow="0" w:lastRow="0" w:firstColumn="0" w:lastColumn="0" w:oddVBand="0" w:evenVBand="0" w:oddHBand="1" w:evenHBand="0" w:firstRowFirstColumn="0" w:firstRowLastColumn="0" w:lastRowFirstColumn="0" w:lastRowLastColumn="0"/>
             </w:pPr>
             <w:r>
@@ -1362,7 +1322,7 @@
           <w:p>
             <w:pPr>
               <w:bidi/>
-              <w:jc w:val="right"/>
+              <w:jc w:val="center"/>
               <w:cnfStyle w:val="000000000000" w:firstRow="0" w:lastRow="0" w:firstColumn="0" w:lastColumn="0" w:oddVBand="0" w:evenVBand="0" w:oddHBand="0" w:evenHBand="0" w:firstRowFirstColumn="0" w:firstRowLastColumn="0" w:lastRowFirstColumn="0" w:lastRowLastColumn="0"/>
             </w:pPr>
             <w:r>
@@ -1403,7 +1363,7 @@
           <w:p>
             <w:pPr>
               <w:bidi/>
-              <w:jc w:val="right"/>
+              <w:jc w:val="center"/>
               <w:cnfStyle w:val="000000100000" w:firstRow="0" w:lastRow="0" w:firstColumn="0" w:lastColumn="0" w:oddVBand="0" w:evenVBand="0" w:oddHBand="1" w:evenHBand="0" w:firstRowFirstColumn="0" w:firstRowLastColumn="0" w:lastRowFirstColumn="0" w:lastRowLastColumn="0"/>
             </w:pPr>
             <w:r>
@@ -1420,7 +1380,6 @@
       <w:pPr>
         <w:pStyle w:val="Heading2"/>
         <w:bidi/>
-        <w:jc w:val="right"/>
       </w:pPr>
       <w:r>
         <w:rPr>
@@ -1433,13 +1392,761 @@
     <w:p>
       <w:pPr>
         <w:bidi/>
-        <w:jc w:val="right"/>
       </w:pPr>
       <w:r>
         <w:rPr>
           <w:rtl/>
         </w:rPr>
         <w:t>۱. نگهداری نتایج مرحله Execute.</w:t>
+      </w:r>
+    </w:p>
+    <w:p>
+      <w:pPr>
+        <w:bidi/>
+      </w:pPr>
+      <w:r>
+        <w:rPr>
+          <w:rtl/>
+        </w:rPr>
+        <w:t>۲. جداسازی مرحله Execute از مرحله Memory.</w:t>
+      </w:r>
+    </w:p>
+    <w:p>
+      <w:pPr>
+        <w:bidi/>
+      </w:pPr>
+      <w:r>
+        <w:rPr>
+          <w:rtl/>
+        </w:rPr>
+        <w:t>۳. انتقال هم‌زمان داده‌ها و سیگنال‌های کنترلی به مرحله بعد.</w:t>
+      </w:r>
+    </w:p>
+    <w:p>
+      <w:pPr>
+        <w:bidi/>
+      </w:pPr>
+      <w:r>
+        <w:rPr>
+          <w:rtl/>
+        </w:rPr>
+        <w:t>۴. جلوگیری از تداخل بین دستورات مختلف در پایپلاین، به‌گونه‌ای که در هر سیکل کلاک یک دستور جدید وارد Execute شود، در حالی که دستور قبلی در Memory پردازش می‌شود.</w:t>
+      </w:r>
+    </w:p>
+    <w:p>
+      <w:pPr>
+        <w:pStyle w:val="Heading1"/>
+        <w:bidi/>
+      </w:pPr>
+      <w:r>
+        <w:rPr>
+          <w:rFonts w:ascii="Arial" w:hAnsi="Arial"/>
+          <w:rtl/>
+        </w:rPr>
+        <w:t>۶. رجیستر EX/MEM — بخش کنترل (Control)</w:t>
+      </w:r>
+    </w:p>
+    <w:p>
+      <w:pPr>
+        <w:bidi/>
+      </w:pPr>
+      <w:r>
+        <w:rPr>
+          <w:rtl/>
+        </w:rPr>
+        <w:t>سیگنال‌های کنترلی تولیدشده در مرحله Execute، پس از عبور از این رجیستر، به مرحله Memory منتقل می‌شوند. در این طراحی هیچ سیگنال کنترلی به‌صورت مستقیم از ID/EX به مرحله Memory منتقل نمی‌شود؛ همه آن‌ها باید از EX/MEM_Control عبور کنند تا هم‌گام‌سازی صحیح پایپلاین حفظ شود.</w:t>
+      </w:r>
+    </w:p>
+    <w:p>
+      <w:pPr>
+        <w:bidi/>
+      </w:pPr>
+      <w:r>
+        <w:rPr>
+          <w:rtl/>
+        </w:rPr>
+        <w:t>- Load و Store: به‌ترتیب فعال‌سازی خواندن و نوشتن در حافظه در مرحله Memory.</w:t>
+      </w:r>
+    </w:p>
+    <w:p>
+      <w:pPr>
+        <w:bidi/>
+      </w:pPr>
+      <w:r>
+        <w:rPr>
+          <w:rtl/>
+        </w:rPr>
+        <w:t>- Write (RegWrite): استفاده در مرحله Write Back برای ثبت نتیجه.</w:t>
+      </w:r>
+    </w:p>
+    <w:p>
+      <w:pPr>
+        <w:bidi/>
+      </w:pPr>
+      <w:r>
+        <w:rPr>
+          <w:rtl/>
+        </w:rPr>
+        <w:t>- ALUResult Enable: تعیین معتبر بودن خروجی ALU برای Write Back.</w:t>
+      </w:r>
+    </w:p>
+    <w:p>
+      <w:pPr>
+        <w:bidi/>
+      </w:pPr>
+      <w:r>
+        <w:rPr>
+          <w:rtl/>
+        </w:rPr>
+        <w:t>- Immediate Enable: انتخاب مقدار Immediate در مسیر Write Back.</w:t>
+      </w:r>
+    </w:p>
+    <w:p>
+      <w:pPr>
+        <w:bidi/>
+      </w:pPr>
+      <w:r>
+        <w:rPr>
+          <w:rtl/>
+        </w:rPr>
+        <w:lastRenderedPageBreak/>
+        <w:t>- AUIPC: کنترل مسیر محاسبه PC + Immediate.</w:t>
+      </w:r>
+    </w:p>
+    <w:p>
+      <w:pPr>
+        <w:bidi/>
+      </w:pPr>
+      <w:r>
+        <w:rPr>
+          <w:rtl/>
+        </w:rPr>
+        <w:t>- StorePC: کنترل بافر مربوط به خروجی PC در مسیر Write Back.</w:t>
+      </w:r>
+    </w:p>
+    <w:p>
+      <w:pPr>
+        <w:bidi/>
+      </w:pPr>
+      <w:r>
+        <w:rPr>
+          <w:rtl/>
+        </w:rPr>
+        <w:t>- PCSrc: تعیین آدرس دستور بعدی در چرخه Fetch.</w:t>
+      </w:r>
+    </w:p>
+    <w:p>
+      <w:pPr>
+        <w:bidi/>
+      </w:pPr>
+      <w:r>
+        <w:rPr>
+          <w:rtl/>
+        </w:rPr>
+        <w:t>- Clock: از کلاک اصلی پردازنده تغذیه می‌شود.</w:t>
+      </w:r>
+    </w:p>
+    <w:p>
+      <w:pPr>
+        <w:bidi/>
+      </w:pPr>
+      <w:r>
+        <w:rPr>
+          <w:i/>
+          <w:rtl/>
+        </w:rPr>
+        <w:t>نکته: در مورد سیگنال Store، در بررسی مسیر سیم‌ها مشخص شد که در مرحله بعدی مورد استفاده مستقیم قرار نمی‌گیرد؛ با این حال، به‌عنوان اقدام احتیاطی در این رجیستر نگه‌داشته شده و در صورت عدم نیاز نهایی، از طرح حذف خواهد شد.</w:t>
+      </w:r>
+    </w:p>
+    <w:p>
+      <w:pPr>
+        <w:pStyle w:val="Heading1"/>
+        <w:bidi/>
+      </w:pPr>
+      <w:r>
+        <w:rPr>
+          <w:rFonts w:ascii="Arial" w:hAnsi="Arial"/>
+          <w:rtl/>
+        </w:rPr>
+        <w:t>۷. رجیستر MEM/WB — بخش داده (Data)</w:t>
+      </w:r>
+    </w:p>
+    <w:p>
+      <w:pPr>
+        <w:bidi/>
+      </w:pPr>
+      <w:r>
+        <w:rPr>
+          <w:rtl/>
+        </w:rPr>
+        <w:t>این رجیستر آخرین رجیستر پایپلاین است و وظیفه هم‌گام‌سازی خروجی‌های مختلف پردازنده و انتقال آن‌ها به مرحله Write Back را بر عهده دارد.</w:t>
+      </w:r>
+    </w:p>
+    <w:p>
+      <w:pPr>
+        <w:bidi/>
+      </w:pPr>
+      <w:r>
+        <w:rPr>
+          <w:rtl/>
+        </w:rPr>
+        <w:t>به‌جای استفاده از یک MUX مرکزی، انتخاب داده نهایی به‌صورت enable-based انجام می‌شود؛ یعنی هر مسیر داده بافر مستقل خود را دارد و تمام مسیرها به‌طور موازی وارد رجیستر می‌شوند، اما تنها مسیر فعال‌شده توسط سیگنال کنترلی مربوطه در نهایت به Register File نوشته می‌شود.</w:t>
+      </w:r>
+    </w:p>
+    <w:p>
+      <w:pPr>
+        <w:bidi/>
+      </w:pPr>
+      <w:r>
+        <w:rPr>
+          <w:rtl/>
+        </w:rPr>
+        <w:t>- ALU Result: خروجی نهایی ALU، در صورت فعال بودن مسیر مربوطه به Register File نوشته می‌شود.</w:t>
+      </w:r>
+    </w:p>
+    <w:p>
+      <w:pPr>
+        <w:bidi/>
+      </w:pPr>
+      <w:r>
+        <w:rPr>
+          <w:rtl/>
+        </w:rPr>
+        <w:t>- Load Value: داده خوانده‌شده از حافظه در دستورات Load.</w:t>
+      </w:r>
+    </w:p>
+    <w:p>
+      <w:pPr>
+        <w:bidi/>
+      </w:pPr>
+      <w:r>
+        <w:rPr>
+          <w:rtl/>
+        </w:rPr>
+        <w:t>- PC + 4: آدرس دستور بعدی، برای دستورات پرشی مانند JAL/JALR.</w:t>
+      </w:r>
+    </w:p>
+    <w:p>
+      <w:pPr>
+        <w:bidi/>
+      </w:pPr>
+      <w:r>
+        <w:rPr>
+          <w:rtl/>
+        </w:rPr>
+        <w:t>- AUIPC Result: خروجی محاسبه‌شده دستور AUIPC.</w:t>
+      </w:r>
+    </w:p>
+    <w:p>
+      <w:pPr>
+        <w:bidi/>
+      </w:pPr>
+      <w:r>
+        <w:rPr>
+          <w:rtl/>
+        </w:rPr>
+        <w:t>- Immediate: در صورت نیاز مسیر Write Back.</w:t>
+      </w:r>
+    </w:p>
+    <w:p>
+      <w:pPr>
+        <w:bidi/>
+      </w:pPr>
+      <w:r>
+        <w:rPr>
+          <w:rtl/>
+        </w:rPr>
+        <w:t>- RD: آدرس رجیستر مقصد که بدون تغییر عبور کرده و مستقیماً به ورودی آدرس Register File متصل می‌شود.</w:t>
+      </w:r>
+    </w:p>
+    <w:p>
+      <w:pPr>
+        <w:pStyle w:val="Heading1"/>
+        <w:bidi/>
+      </w:pPr>
+      <w:r>
+        <w:rPr>
+          <w:rFonts w:ascii="Arial" w:hAnsi="Arial"/>
+          <w:rtl/>
+        </w:rPr>
+        <w:t>۸. رجیستر MEM/WB — بخش کنترل (Control)</w:t>
+      </w:r>
+    </w:p>
+    <w:p>
+      <w:pPr>
+        <w:bidi/>
+      </w:pPr>
+      <w:r>
+        <w:rPr>
+          <w:rtl/>
+        </w:rPr>
+        <w:t>این رجیستر، آخرین حلقه هم‌گام‌سازی سیگنال‌های کنترلی در پایپلاین است. مطابق با ساختار enable-based، این رجیستر هیچ تصمیم جدیدی تولید نمی‌کند و صرفاً سیگنال‌های فعال‌سازی مسیرهای مختلف داده را که در مراحل قبل تولید شده‌اند، به مرحله Write Back منتقل می‌کند؛ در هر سیکل تنها یکی از این مسیرها فعال است.</w:t>
+      </w:r>
+    </w:p>
+    <w:p>
+      <w:pPr>
+        <w:bidi/>
+      </w:pPr>
+      <w:r>
+        <w:rPr>
+          <w:rtl/>
+        </w:rPr>
+        <w:t>- Write: فعال‌سازی نوشتن در Register File.</w:t>
+      </w:r>
+    </w:p>
+    <w:p>
+      <w:pPr>
+        <w:bidi/>
+      </w:pPr>
+      <w:r>
+        <w:rPr>
+          <w:rtl/>
+        </w:rPr>
+        <w:t>- ALUResult Enable: فعال‌سازی مسیر خروجی ALU.</w:t>
+      </w:r>
+    </w:p>
+    <w:p>
+      <w:pPr>
+        <w:bidi/>
+      </w:pPr>
+      <w:r>
+        <w:rPr>
+          <w:rtl/>
+        </w:rPr>
+        <w:t>- Load Enable: فعال‌سازی مسیر داده خوانده‌شده از حافظه.</w:t>
+      </w:r>
+    </w:p>
+    <w:p>
+      <w:pPr>
+        <w:bidi/>
+      </w:pPr>
+      <w:r>
+        <w:rPr>
+          <w:rtl/>
+        </w:rPr>
+        <w:t>- StorePC: فعال‌سازی انتقال مقدار PC+4 (آدرس بازگشت) به Write Back.</w:t>
+      </w:r>
+    </w:p>
+    <w:p>
+      <w:pPr>
+        <w:bidi/>
+      </w:pPr>
+      <w:r>
+        <w:rPr>
+          <w:rtl/>
+        </w:rPr>
+        <w:t>- AUIPC Enable: فعال‌سازی مسیر خروجی دستور AUIPC.</w:t>
+      </w:r>
+    </w:p>
+    <w:p>
+      <w:pPr>
+        <w:bidi/>
+      </w:pPr>
+      <w:r>
+        <w:rPr>
+          <w:rtl/>
+        </w:rPr>
+        <w:t>- Immediate Enable: فعال‌سازی مسیر مقدار Immediate.</w:t>
+      </w:r>
+    </w:p>
+    <w:p>
+      <w:pPr>
+        <w:pStyle w:val="Heading1"/>
+        <w:bidi/>
+      </w:pPr>
+      <w:r>
+        <w:rPr>
+          <w:rFonts w:ascii="Arial" w:hAnsi="Arial"/>
+          <w:rtl/>
+        </w:rPr>
+        <w:lastRenderedPageBreak/>
+        <w:t>۹. پیاده‌سازی منطق Jump و Branch (مکانیزم Flush)</w:t>
+      </w:r>
+    </w:p>
+    <w:p>
+      <w:pPr>
+        <w:bidi/>
+      </w:pPr>
+      <w:r>
+        <w:rPr>
+          <w:rtl/>
+        </w:rPr>
+        <w:t>در اجرای برنامه‌هایی شامل دستورهای Jump و Branch، مشکلی به‌وجود می‌آمد که ناشی از ورود دستورات نادرست به پایپلاین، پیش از مشخص شدن نتیجه پرش یا انشعاب، بود. برای رفع این مشکل، مکانیزم Flush در پایپلاین پیاده‌سازی شد.</w:t>
+      </w:r>
+    </w:p>
+    <w:p>
+      <w:pPr>
+        <w:bidi/>
+      </w:pPr>
+      <w:r>
+        <w:rPr>
+          <w:rtl/>
+        </w:rPr>
+        <w:t>در مرحله Execute، هنگامی که سیگنال Relative Jump تولید می‌شود، سیگنال Flush فعال شده و به دو رجیستر IF/ID و ID/EX_Control اعمال می‌گردد:</w:t>
+      </w:r>
+    </w:p>
+    <w:p>
+      <w:pPr>
+        <w:bidi/>
+      </w:pPr>
+      <w:r>
+        <w:rPr>
+          <w:rtl/>
+        </w:rPr>
+        <w:t>- در رجیستر IF/ID: سیگنال Flush به ورودی انتخاب‌کننده (MUX) این رجیستر متصل است. این MUX بین دستور دریافتی از حافظه دستور و دستور NOP (کد ۰x00000013) انتخاب می‌کند. در حالت عادی، دستور واقعی وارد رجیستر می‌شود؛ اما با فعال شدن Flush، ورودی به NOP تغییر می‌کند و دستوراتی که پیش از مشخص شدن نتیجه Jump/Branch وارد Fetch و Decode شده بودند، عملاً بی‌اثر می‌شوند.</w:t>
+      </w:r>
+    </w:p>
+    <w:p>
+      <w:pPr>
+        <w:bidi/>
+      </w:pPr>
+      <w:r>
+        <w:rPr>
+          <w:rtl/>
+        </w:rPr>
+        <w:t>- در رجیستر ID/EX_Control: نات سیگنال Flush با تمام سیگنال‌های کنترلی این مرحله از طریق گیت‌های AND ترکیب می‌شود. با فعال شدن Flush، تمام سیگنال‌های کنترلی صفر شده و دستور موجود در مرحله Decode مانند یک NOP در پایپلاین حرکت می‌کند و هیچ عملیاتی در مراحل بعدی انجام نمی‌دهد.</w:t>
+      </w:r>
+    </w:p>
+    <w:p>
+      <w:pPr>
+        <w:bidi/>
+      </w:pPr>
+      <w:r>
+        <w:rPr>
+          <w:rtl/>
+        </w:rPr>
+        <w:t>با استفاده از این مکانیزم، دستورهای نادرستی که پس از یک Jump گرفته‌شده وارد پایپلاین شده بودند حذف می‌شوند و شمارنده برنامه (PC) از آدرس صحیح ادامه اجرا را دنبال می‌کند. به این ترتیب، منطق اجرای دستورهای کنترلی به‌درستی در پایپلاین پیاده‌سازی شده و از اجرای ناخواسته دستورات جلوگیری می‌شود. در طول پیاده‌سازی این بخش، چند اشکال (Bug) شناسایی و برطرف شد.</w:t>
+      </w:r>
+    </w:p>
+    <w:p>
+      <w:pPr>
+        <w:pStyle w:val="Heading1"/>
+        <w:bidi/>
+      </w:pPr>
+      <w:r>
+        <w:rPr>
+          <w:rFonts w:ascii="Arial" w:hAnsi="Arial"/>
+          <w:rtl/>
+        </w:rPr>
+        <w:t>۱۰. تست و ارزیابی عملکرد پردازنده</w:t>
+      </w:r>
+    </w:p>
+    <w:p>
+      <w:pPr>
+        <w:bidi/>
+      </w:pPr>
+      <w:r>
+        <w:rPr>
+          <w:rtl/>
+        </w:rPr>
+        <w:t>در این مرحله از پروژه تنها خط لوله پنج‌مرحله‌ای پردازنده پیاده‌سازی شده است و مکانیزم‌های Forwarding، Hazard Detection و Stall هنوز به معماری اضافه نشده‌اند. به همین دلیل، در تمامی تست‌هایی که وابستگی داده‌ای بین دستورات وجود دارد، از چهار دستور NOP استفاده شده است تا نتایج دستورات قبلی به مرحله Write Back (WB) رسیده و در بانک رجیسترها ثبت شوند. این روش امکان بررسی صحیح عملکرد واحدهای مختلف پردازنده را بدون تأثیر مخاطرات داده‌ای فراهم می‌کند.</w:t>
+      </w:r>
+    </w:p>
+    <w:p>
+      <w:pPr>
+        <w:pStyle w:val="Heading2"/>
+        <w:bidi/>
+      </w:pPr>
+      <w:r>
+        <w:rPr>
+          <w:rFonts w:ascii="Arial" w:hAnsi="Arial"/>
+          <w:rtl/>
+        </w:rPr>
+        <w:t>۱. تست عملکرد واحد ALU</w:t>
+      </w:r>
+    </w:p>
+    <w:p>
+      <w:pPr>
+        <w:bidi/>
+      </w:pPr>
+      <w:r>
+        <w:rPr>
+          <w:b/>
+          <w:rtl/>
+        </w:rPr>
+        <w:t>هدف تست:</w:t>
+      </w:r>
+    </w:p>
+    <w:p>
+      <w:pPr>
+        <w:bidi/>
+      </w:pPr>
+      <w:r>
+        <w:rPr>
+          <w:rtl/>
+        </w:rPr>
+        <w:t>بررسی صحت عملکرد واحد محاسبات و منطق (ALU) در اجرای دستورات محاسباتی و منطقی. در این بخش تمامی عملیات اصلی ALU شامل ADD, SUB, AND, OR, XOR, SLL, SRL, SLT, SLTU مورد بررسی قرار گرفتند.</w:t>
+      </w:r>
+    </w:p>
+    <w:p>
+      <w:pPr>
+        <w:bidi/>
+      </w:pPr>
+      <w:r>
+        <w:rPr>
+          <w:rtl/>
+        </w:rPr>
+        <w:t>از آنجا که در این مرحله از پروژه مکانیزم Forwarding و Hazard Detection پیاده‌سازی نشده است، بین مقداردهی اولیه رجیسترها و اجرای دستور وابسته، چهار دستور NOP قرار داده شده است تا داده‌ها فرصت کافی برای رسیدن به مرحله Write Back (WB) را داشته باشند و مقدار صحیح در بانک رجیسترها ذخیره شود.</w:t>
+      </w:r>
+    </w:p>
+    <w:p>
+      <w:pPr>
+        <w:bidi/>
+      </w:pPr>
+      <w:r>
+        <w:rPr>
+          <w:b/>
+          <w:rtl/>
+        </w:rPr>
+        <w:t>نمونه کد:</w:t>
+      </w:r>
+    </w:p>
+    <w:p>
+      <w:pPr>
+        <w:rPr>
+          <w:rFonts w:ascii="Courier New" w:hAnsi="Courier New"/>
+          <w:sz w:val="20"/>
+        </w:rPr>
+      </w:pPr>
+      <w:proofErr w:type="gramStart"/>
+      <w:r>
+        <w:rPr>
+          <w:rFonts w:ascii="Courier New" w:hAnsi="Courier New"/>
+          <w:sz w:val="20"/>
+        </w:rPr>
+        <w:t>.global</w:t>
+      </w:r>
+      <w:proofErr w:type="gramEnd"/>
+      <w:r>
+        <w:rPr>
+          <w:rFonts w:ascii="Courier New" w:hAnsi="Courier New"/>
+          <w:sz w:val="20"/>
+        </w:rPr>
+        <w:t xml:space="preserve"> _boot</w:t>
+      </w:r>
+      <w:r>
+        <w:rPr>
+          <w:rFonts w:ascii="Courier New" w:hAnsi="Courier New"/>
+          <w:sz w:val="20"/>
+        </w:rPr>
+        <w:br/>
+        <w:t>.text</w:t>
+      </w:r>
+      <w:r>
+        <w:rPr>
+          <w:rFonts w:ascii="Courier New" w:hAnsi="Courier New"/>
+          <w:sz w:val="20"/>
+        </w:rPr>
+        <w:br/>
+        <w:t xml:space="preserve">.option </w:t>
+      </w:r>
+      <w:proofErr w:type="spellStart"/>
+      <w:r>
+        <w:rPr>
+          <w:rFonts w:ascii="Courier New" w:hAnsi="Courier New"/>
+          <w:sz w:val="20"/>
+        </w:rPr>
+        <w:t>norvc</w:t>
+      </w:r>
+      <w:proofErr w:type="spellEnd"/>
+      <w:r>
+        <w:rPr>
+          <w:rFonts w:ascii="Courier New" w:hAnsi="Courier New"/>
+          <w:sz w:val="20"/>
+        </w:rPr>
+        <w:br/>
+      </w:r>
+      <w:r>
+        <w:rPr>
+          <w:rFonts w:ascii="Courier New" w:hAnsi="Courier New"/>
+          <w:sz w:val="20"/>
+        </w:rPr>
+        <w:br/>
+      </w:r>
+      <w:r>
+        <w:rPr>
+          <w:rFonts w:ascii="Courier New" w:hAnsi="Courier New"/>
+          <w:sz w:val="20"/>
+        </w:rPr>
+        <w:lastRenderedPageBreak/>
+        <w:t>_boot:</w:t>
+      </w:r>
+      <w:r>
+        <w:rPr>
+          <w:rFonts w:ascii="Courier New" w:hAnsi="Courier New"/>
+          <w:sz w:val="20"/>
+        </w:rPr>
+        <w:br/>
+        <w:t xml:space="preserve">    </w:t>
+      </w:r>
+      <w:proofErr w:type="spellStart"/>
+      <w:r>
+        <w:rPr>
+          <w:rFonts w:ascii="Courier New" w:hAnsi="Courier New"/>
+          <w:sz w:val="20"/>
+        </w:rPr>
+        <w:t>addi</w:t>
+      </w:r>
+      <w:proofErr w:type="spellEnd"/>
+      <w:r>
+        <w:rPr>
+          <w:rFonts w:ascii="Courier New" w:hAnsi="Courier New"/>
+          <w:sz w:val="20"/>
+        </w:rPr>
+        <w:t xml:space="preserve"> x1, x0, 10</w:t>
+      </w:r>
+      <w:r>
+        <w:rPr>
+          <w:rFonts w:ascii="Courier New" w:hAnsi="Courier New"/>
+          <w:sz w:val="20"/>
+        </w:rPr>
+        <w:br/>
+        <w:t xml:space="preserve">    </w:t>
+      </w:r>
+      <w:proofErr w:type="spellStart"/>
+      <w:r>
+        <w:rPr>
+          <w:rFonts w:ascii="Courier New" w:hAnsi="Courier New"/>
+          <w:sz w:val="20"/>
+        </w:rPr>
+        <w:t>addi</w:t>
+      </w:r>
+      <w:proofErr w:type="spellEnd"/>
+      <w:r>
+        <w:rPr>
+          <w:rFonts w:ascii="Courier New" w:hAnsi="Courier New"/>
+          <w:sz w:val="20"/>
+        </w:rPr>
+        <w:t xml:space="preserve"> x2, x0, 4</w:t>
+      </w:r>
+      <w:r>
+        <w:rPr>
+          <w:rFonts w:ascii="Courier New" w:hAnsi="Courier New"/>
+          <w:sz w:val="20"/>
+        </w:rPr>
+        <w:br/>
+      </w:r>
+      <w:r>
+        <w:rPr>
+          <w:rFonts w:ascii="Courier New" w:hAnsi="Courier New"/>
+          <w:sz w:val="20"/>
+        </w:rPr>
+        <w:br/>
+        <w:t xml:space="preserve">    </w:t>
+      </w:r>
+      <w:proofErr w:type="spellStart"/>
+      <w:r>
+        <w:rPr>
+          <w:rFonts w:ascii="Courier New" w:hAnsi="Courier New"/>
+          <w:sz w:val="20"/>
+        </w:rPr>
+        <w:t>nop</w:t>
+      </w:r>
+      <w:proofErr w:type="spellEnd"/>
+      <w:r>
+        <w:rPr>
+          <w:rFonts w:ascii="Courier New" w:hAnsi="Courier New"/>
+          <w:sz w:val="20"/>
+        </w:rPr>
+        <w:br/>
+        <w:t xml:space="preserve">    </w:t>
+      </w:r>
+      <w:proofErr w:type="spellStart"/>
+      <w:r>
+        <w:rPr>
+          <w:rFonts w:ascii="Courier New" w:hAnsi="Courier New"/>
+          <w:sz w:val="20"/>
+        </w:rPr>
+        <w:t>nop</w:t>
+      </w:r>
+      <w:proofErr w:type="spellEnd"/>
+      <w:r>
+        <w:rPr>
+          <w:rFonts w:ascii="Courier New" w:hAnsi="Courier New"/>
+          <w:sz w:val="20"/>
+        </w:rPr>
+        <w:br/>
+        <w:t xml:space="preserve">    </w:t>
+      </w:r>
+      <w:proofErr w:type="spellStart"/>
+      <w:r>
+        <w:rPr>
+          <w:rFonts w:ascii="Courier New" w:hAnsi="Courier New"/>
+          <w:sz w:val="20"/>
+        </w:rPr>
+        <w:t>nop</w:t>
+      </w:r>
+      <w:proofErr w:type="spellEnd"/>
+      <w:r>
+        <w:rPr>
+          <w:rFonts w:ascii="Courier New" w:hAnsi="Courier New"/>
+          <w:sz w:val="20"/>
+        </w:rPr>
+        <w:br/>
+        <w:t xml:space="preserve">    </w:t>
+      </w:r>
+      <w:proofErr w:type="spellStart"/>
+      <w:r>
+        <w:rPr>
+          <w:rFonts w:ascii="Courier New" w:hAnsi="Courier New"/>
+          <w:sz w:val="20"/>
+        </w:rPr>
+        <w:t>nop</w:t>
+      </w:r>
+      <w:proofErr w:type="spellEnd"/>
+      <w:r>
+        <w:rPr>
+          <w:rFonts w:ascii="Courier New" w:hAnsi="Courier New"/>
+          <w:sz w:val="20"/>
+        </w:rPr>
+        <w:br/>
+      </w:r>
+      <w:r>
+        <w:rPr>
+          <w:rFonts w:ascii="Courier New" w:hAnsi="Courier New"/>
+          <w:sz w:val="20"/>
+        </w:rPr>
+        <w:br/>
+        <w:t xml:space="preserve">    add x3, x1, x2</w:t>
+      </w:r>
+      <w:r>
+        <w:rPr>
+          <w:rFonts w:ascii="Courier New" w:hAnsi="Courier New"/>
+          <w:sz w:val="20"/>
+        </w:rPr>
+        <w:br/>
+      </w:r>
+      <w:r>
+        <w:rPr>
+          <w:rFonts w:ascii="Courier New" w:hAnsi="Courier New"/>
+          <w:sz w:val="20"/>
+        </w:rPr>
+        <w:br/>
+        <w:t>end:</w:t>
+      </w:r>
+      <w:r>
+        <w:rPr>
+          <w:rFonts w:ascii="Courier New" w:hAnsi="Courier New"/>
+          <w:sz w:val="20"/>
+        </w:rPr>
+        <w:br/>
+        <w:t xml:space="preserve">    </w:t>
+      </w:r>
+      <w:proofErr w:type="spellStart"/>
+      <w:r>
+        <w:rPr>
+          <w:rFonts w:ascii="Courier New" w:hAnsi="Courier New"/>
+          <w:sz w:val="20"/>
+        </w:rPr>
+        <w:t>beq</w:t>
+      </w:r>
+      <w:proofErr w:type="spellEnd"/>
+      <w:r>
+        <w:rPr>
+          <w:rFonts w:ascii="Courier New" w:hAnsi="Courier New"/>
+          <w:sz w:val="20"/>
+        </w:rPr>
+        <w:t xml:space="preserve"> x0, x0, end</w:t>
       </w:r>
     </w:p>
     <w:p>
@@ -1449,21 +2156,52 @@
       </w:pPr>
       <w:r>
         <w:rPr>
+          <w:b/>
           <w:rtl/>
         </w:rPr>
-        <w:t>۲. جداسازی مرحله Execute از مرحله Memory.</w:t>
+        <w:t>نتیجه مورد انتظار:</w:t>
+      </w:r>
+    </w:p>
+    <w:p>
+      <w:r>
+        <w:rPr>
+          <w:rFonts w:ascii="Courier New" w:hAnsi="Courier New"/>
+          <w:sz w:val="20"/>
+        </w:rPr>
+        <w:t>x1 = 10</w:t>
+      </w:r>
+      <w:r>
+        <w:rPr>
+          <w:rFonts w:ascii="Courier New" w:hAnsi="Courier New"/>
+          <w:sz w:val="20"/>
+        </w:rPr>
+        <w:br/>
+        <w:t>x2 = 4</w:t>
+      </w:r>
+      <w:r>
+        <w:rPr>
+          <w:rFonts w:ascii="Courier New" w:hAnsi="Courier New"/>
+          <w:sz w:val="20"/>
+        </w:rPr>
+        <w:br/>
+        <w:t>x3 = 14</w:t>
       </w:r>
     </w:p>
     <w:p>
       <w:pPr>
         <w:bidi/>
         <w:jc w:val="right"/>
-      </w:pPr>
-      <w:r>
-        <w:rPr>
+        <w:rPr>
+          <w:b/>
           <w:rtl/>
         </w:rPr>
-        <w:t>۳. انتقال هم‌زمان داده‌ها و سیگنال‌های کنترلی به مرحله بعد.</w:t>
+      </w:pPr>
+      <w:r>
+        <w:rPr>
+          <w:b/>
+          <w:rtl/>
+        </w:rPr>
+        <w:t>نتیجه:</w:t>
       </w:r>
     </w:p>
     <w:p>
@@ -1473,754 +2211,8 @@
       </w:pPr>
       <w:r>
         <w:rPr>
-          <w:rtl/>
-        </w:rPr>
-        <w:t>۴. جلوگیری از تداخل بین دستورات مختلف در پایپلاین، به‌گونه‌ای که در هر سیکل کلاک یک دستور جدید وارد Execute شود، در حالی که دستور قبلی در Memory پردازش می‌شود.</w:t>
-      </w:r>
-    </w:p>
-    <w:p>
-      <w:pPr>
-        <w:pStyle w:val="Heading1"/>
-        <w:bidi/>
-        <w:jc w:val="right"/>
-      </w:pPr>
-      <w:r>
-        <w:rPr>
-          <w:rFonts w:ascii="Arial" w:hAnsi="Arial"/>
-          <w:rtl/>
-        </w:rPr>
-        <w:t>۶. رجیستر EX/MEM — بخش کنترل (Control)</w:t>
-      </w:r>
-    </w:p>
-    <w:p>
-      <w:pPr>
-        <w:bidi/>
-        <w:jc w:val="right"/>
-      </w:pPr>
-      <w:r>
-        <w:rPr>
-          <w:rtl/>
-        </w:rPr>
-        <w:t>سیگنال‌های کنترلی تولیدشده در مرحله Execute، پس از عبور از این رجیستر، به مرحله Memory منتقل می‌شوند. در این طراحی هیچ سیگنال کنترلی به‌صورت مستقیم از ID/EX به مرحله Memory منتقل نمی‌شود؛ همه آن‌ها باید از EX/MEM_Control عبور کنند تا هم‌گام‌سازی صحیح پایپلاین حفظ شود.</w:t>
-      </w:r>
-    </w:p>
-    <w:p>
-      <w:pPr>
-        <w:bidi/>
-        <w:jc w:val="right"/>
-      </w:pPr>
-      <w:r>
-        <w:rPr>
-          <w:rtl/>
-        </w:rPr>
-        <w:t>- Load و Store: به‌ترتیب فعال‌سازی خواندن و نوشتن در حافظه در مرحله Memory.</w:t>
-      </w:r>
-    </w:p>
-    <w:p>
-      <w:pPr>
-        <w:bidi/>
-        <w:jc w:val="right"/>
-      </w:pPr>
-      <w:r>
-        <w:rPr>
-          <w:rtl/>
-        </w:rPr>
-        <w:t>- Write (RegWrite): استفاده در مرحله Write Back برای ثبت نتیجه.</w:t>
-      </w:r>
-    </w:p>
-    <w:p>
-      <w:pPr>
-        <w:bidi/>
-        <w:jc w:val="right"/>
-      </w:pPr>
-      <w:r>
-        <w:rPr>
-          <w:rtl/>
-        </w:rPr>
-        <w:t>- ALUResult Enable: تعیین معتبر بودن خروجی ALU برای Write Back.</w:t>
-      </w:r>
-    </w:p>
-    <w:p>
-      <w:pPr>
-        <w:bidi/>
-        <w:jc w:val="right"/>
-      </w:pPr>
-      <w:r>
-        <w:rPr>
-          <w:rtl/>
-        </w:rPr>
-        <w:t>- Immediate Enable: انتخاب مقدار Immediate در مسیر Write Back.</w:t>
-      </w:r>
-    </w:p>
-    <w:p>
-      <w:pPr>
-        <w:bidi/>
-        <w:jc w:val="right"/>
-      </w:pPr>
-      <w:r>
-        <w:rPr>
-          <w:rtl/>
-        </w:rPr>
-        <w:lastRenderedPageBreak/>
-        <w:t>- AUIPC: کنترل مسیر محاسبه PC + Immediate.</w:t>
-      </w:r>
-    </w:p>
-    <w:p>
-      <w:pPr>
-        <w:bidi/>
-        <w:jc w:val="right"/>
-      </w:pPr>
-      <w:r>
-        <w:rPr>
-          <w:rtl/>
-        </w:rPr>
-        <w:t>- StorePC: کنترل بافر مربوط به خروجی PC در مسیر Write Back.</w:t>
-      </w:r>
-    </w:p>
-    <w:p>
-      <w:pPr>
-        <w:bidi/>
-        <w:jc w:val="right"/>
-      </w:pPr>
-      <w:r>
-        <w:rPr>
-          <w:rtl/>
-        </w:rPr>
-        <w:t>- PCSrc: تعیین آدرس دستور بعدی در چرخه Fetch.</w:t>
-      </w:r>
-    </w:p>
-    <w:p>
-      <w:pPr>
-        <w:bidi/>
-        <w:jc w:val="right"/>
-      </w:pPr>
-      <w:r>
-        <w:rPr>
-          <w:rtl/>
-        </w:rPr>
-        <w:t>- Clock: از کلاک اصلی پردازنده تغذیه می‌شود.</w:t>
-      </w:r>
-    </w:p>
-    <w:p>
-      <w:pPr>
-        <w:bidi/>
-        <w:jc w:val="right"/>
-      </w:pPr>
-      <w:r>
-        <w:rPr>
-          <w:i/>
-          <w:rtl/>
-        </w:rPr>
-        <w:t>نکته: در مورد سیگنال Store، در بررسی مسیر سیم‌ها مشخص شد که در مرحله بعدی مورد استفاده مستقیم قرار نمی‌گیرد؛ با این حال، به‌عنوان اقدام احتیاطی در این رجیستر نگه‌داشته شده و در صورت عدم نیاز نهایی، از طرح حذف خواهد شد.</w:t>
-      </w:r>
-    </w:p>
-    <w:p>
-      <w:pPr>
-        <w:pStyle w:val="Heading1"/>
-        <w:bidi/>
-        <w:jc w:val="right"/>
-      </w:pPr>
-      <w:r>
-        <w:rPr>
-          <w:rFonts w:ascii="Arial" w:hAnsi="Arial"/>
-          <w:rtl/>
-        </w:rPr>
-        <w:t>۷. رجیستر MEM/WB — بخش داده (Data)</w:t>
-      </w:r>
-    </w:p>
-    <w:p>
-      <w:pPr>
-        <w:bidi/>
-        <w:jc w:val="right"/>
-      </w:pPr>
-      <w:r>
-        <w:rPr>
-          <w:rtl/>
-        </w:rPr>
-        <w:t>این رجیستر آخرین رجیستر پایپلاین است و وظیفه هم‌گام‌سازی خروجی‌های مختلف پردازنده و انتقال آن‌ها به مرحله Write Back را بر عهده دارد.</w:t>
-      </w:r>
-    </w:p>
-    <w:p>
-      <w:pPr>
-        <w:bidi/>
-        <w:jc w:val="right"/>
-      </w:pPr>
-      <w:r>
-        <w:rPr>
-          <w:rtl/>
-        </w:rPr>
-        <w:t>به‌جای استفاده از یک MUX مرکزی، انتخاب داده نهایی به‌صورت enable-based انجام می‌شود؛ یعنی هر مسیر داده بافر مستقل خود را دارد و تمام مسیرها به‌طور موازی وارد رجیستر می‌شوند، اما تنها مسیر فعال‌شده توسط سیگنال کنترلی مربوطه در نهایت به Register File نوشته می‌شود.</w:t>
-      </w:r>
-    </w:p>
-    <w:p>
-      <w:pPr>
-        <w:bidi/>
-        <w:jc w:val="right"/>
-      </w:pPr>
-      <w:r>
-        <w:rPr>
-          <w:rtl/>
-        </w:rPr>
-        <w:t>- ALU Result: خروجی نهایی ALU، در صورت فعال بودن مسیر مربوطه به Register File نوشته می‌شود.</w:t>
-      </w:r>
-    </w:p>
-    <w:p>
-      <w:pPr>
-        <w:bidi/>
-        <w:jc w:val="right"/>
-      </w:pPr>
-      <w:r>
-        <w:rPr>
-          <w:rtl/>
-        </w:rPr>
-        <w:t>- Load Value: داده خوانده‌شده از حافظه در دستورات Load.</w:t>
-      </w:r>
-    </w:p>
-    <w:p>
-      <w:pPr>
-        <w:bidi/>
-        <w:jc w:val="right"/>
-      </w:pPr>
-      <w:r>
-        <w:rPr>
-          <w:rtl/>
-        </w:rPr>
-        <w:t>- PC + 4: آدرس دستور بعدی، برای دستورات پرشی مانند JAL/JALR.</w:t>
-      </w:r>
-    </w:p>
-    <w:p>
-      <w:pPr>
-        <w:bidi/>
-        <w:jc w:val="right"/>
-      </w:pPr>
-      <w:r>
-        <w:rPr>
-          <w:rtl/>
-        </w:rPr>
-        <w:t>- AUIPC Result: خروجی محاسبه‌شده دستور AUIPC.</w:t>
-      </w:r>
-    </w:p>
-    <w:p>
-      <w:pPr>
-        <w:bidi/>
-        <w:jc w:val="right"/>
-      </w:pPr>
-      <w:r>
-        <w:rPr>
-          <w:rtl/>
-        </w:rPr>
-        <w:t>- Immediate: در صورت نیاز مسیر Write Back.</w:t>
-      </w:r>
-    </w:p>
-    <w:p>
-      <w:pPr>
-        <w:bidi/>
-        <w:jc w:val="right"/>
-      </w:pPr>
-      <w:r>
-        <w:rPr>
-          <w:rtl/>
-        </w:rPr>
-        <w:t>- RD: آدرس رجیستر مقصد که بدون تغییر عبور کرده و مستقیماً به ورودی آدرس Register File متصل می‌شود.</w:t>
-      </w:r>
-    </w:p>
-    <w:p>
-      <w:pPr>
-        <w:pStyle w:val="Heading1"/>
-        <w:bidi/>
-        <w:jc w:val="right"/>
-      </w:pPr>
-      <w:r>
-        <w:rPr>
-          <w:rFonts w:ascii="Arial" w:hAnsi="Arial"/>
-          <w:rtl/>
-        </w:rPr>
-        <w:t>۸. رجیستر MEM/WB — بخش کنترل (Control)</w:t>
-      </w:r>
-    </w:p>
-    <w:p>
-      <w:pPr>
-        <w:bidi/>
-        <w:jc w:val="right"/>
-      </w:pPr>
-      <w:r>
-        <w:rPr>
-          <w:rtl/>
-        </w:rPr>
-        <w:t>این رجیستر، آخرین حلقه هم‌گام‌سازی سیگنال‌های کنترلی در پایپلاین است. مطابق با ساختار enable-based، این رجیستر هیچ تصمیم جدیدی تولید نمی‌کند و صرفاً سیگنال‌های فعال‌سازی مسیرهای مختلف داده را که در مراحل قبل تولید شده‌اند، به مرحله Write Back منتقل می‌کند؛ در هر سیکل تنها یکی از این مسیرها فعال است.</w:t>
-      </w:r>
-    </w:p>
-    <w:p>
-      <w:pPr>
-        <w:bidi/>
-        <w:jc w:val="right"/>
-      </w:pPr>
-      <w:r>
-        <w:rPr>
-          <w:rtl/>
-        </w:rPr>
-        <w:t>- Write: فعال‌سازی نوشتن در Register File.</w:t>
-      </w:r>
-    </w:p>
-    <w:p>
-      <w:pPr>
-        <w:bidi/>
-        <w:jc w:val="right"/>
-      </w:pPr>
-      <w:r>
-        <w:rPr>
-          <w:rtl/>
-        </w:rPr>
-        <w:t>- ALUResult Enable: فعال‌سازی مسیر خروجی ALU.</w:t>
-      </w:r>
-    </w:p>
-    <w:p>
-      <w:pPr>
-        <w:bidi/>
-        <w:jc w:val="right"/>
-      </w:pPr>
-      <w:r>
-        <w:rPr>
-          <w:rtl/>
-        </w:rPr>
-        <w:t>- Load Enable: فعال‌سازی مسیر داده خوانده‌شده از حافظه.</w:t>
-      </w:r>
-    </w:p>
-    <w:p>
-      <w:pPr>
-        <w:bidi/>
-        <w:jc w:val="right"/>
-      </w:pPr>
-      <w:r>
-        <w:rPr>
-          <w:rtl/>
-        </w:rPr>
-        <w:t>- StorePC: فعال‌سازی انتقال مقدار PC+4 (آدرس بازگشت) به Write Back.</w:t>
-      </w:r>
-    </w:p>
-    <w:p>
-      <w:pPr>
-        <w:bidi/>
-        <w:jc w:val="right"/>
-      </w:pPr>
-      <w:r>
-        <w:rPr>
-          <w:rtl/>
-        </w:rPr>
-        <w:t>- AUIPC Enable: فعال‌سازی مسیر خروجی دستور AUIPC.</w:t>
-      </w:r>
-    </w:p>
-    <w:p>
-      <w:pPr>
-        <w:bidi/>
-        <w:jc w:val="right"/>
-      </w:pPr>
-      <w:r>
-        <w:rPr>
-          <w:rtl/>
-        </w:rPr>
-        <w:t>- Immediate Enable: فعال‌سازی مسیر مقدار Immediate.</w:t>
-      </w:r>
-    </w:p>
-    <w:p>
-      <w:pPr>
-        <w:pStyle w:val="Heading1"/>
-        <w:bidi/>
-        <w:jc w:val="right"/>
-      </w:pPr>
-      <w:r>
-        <w:rPr>
-          <w:rFonts w:ascii="Arial" w:hAnsi="Arial"/>
-          <w:rtl/>
-        </w:rPr>
-        <w:lastRenderedPageBreak/>
-        <w:t>۹. پیاده‌سازی منطق Jump و Branch (مکانیزم Flush)</w:t>
-      </w:r>
-    </w:p>
-    <w:p>
-      <w:pPr>
-        <w:bidi/>
-        <w:jc w:val="right"/>
-      </w:pPr>
-      <w:r>
-        <w:rPr>
-          <w:rtl/>
-        </w:rPr>
-        <w:t>در اجرای برنامه‌هایی شامل دستورهای Jump و Branch، مشکلی به‌وجود می‌آمد که ناشی از ورود دستورات نادرست به پایپلاین، پیش از مشخص شدن نتیجه پرش یا انشعاب، بود. برای رفع این مشکل، مکانیزم Flush در پایپلاین پیاده‌سازی شد.</w:t>
-      </w:r>
-    </w:p>
-    <w:p>
-      <w:pPr>
-        <w:bidi/>
-        <w:jc w:val="right"/>
-      </w:pPr>
-      <w:r>
-        <w:rPr>
-          <w:rtl/>
-        </w:rPr>
-        <w:t>در مرحله Execute، هنگامی که سیگنال Relative Jump تولید می‌شود، سیگنال Flush فعال شده و به دو رجیستر IF/ID و ID/EX_Control اعمال می‌گردد:</w:t>
-      </w:r>
-    </w:p>
-    <w:p>
-      <w:pPr>
-        <w:bidi/>
-        <w:jc w:val="right"/>
-      </w:pPr>
-      <w:r>
-        <w:rPr>
-          <w:rtl/>
-        </w:rPr>
-        <w:t>- در رجیستر IF/ID: سیگنال Flush به ورودی انتخاب‌کننده (MUX) این رجیستر متصل است. این MUX بین دستور دریافتی از حافظه دستور و دستور NOP (کد ۰x00000013) انتخاب می‌کند. در حالت عادی، دستور واقعی وارد رجیستر می‌شود؛ اما با فعال شدن Flush، ورودی به NOP تغییر می‌کند و دستوراتی که پیش از مشخص شدن نتیجه Jump/Branch وارد Fetch و Decode شده بودند، عملاً بی‌اثر می‌شوند.</w:t>
-      </w:r>
-    </w:p>
-    <w:p>
-      <w:pPr>
-        <w:bidi/>
-        <w:jc w:val="right"/>
-      </w:pPr>
-      <w:r>
-        <w:rPr>
-          <w:rtl/>
-        </w:rPr>
-        <w:t>- در رجیستر ID/EX_Control: نات سیگنال Flush با تمام سیگنال‌های کنترلی این مرحله از طریق گیت‌های AND ترکیب می‌شود. با فعال شدن Flush، تمام سیگنال‌های کنترلی صفر شده و دستور موجود در مرحله Decode مانند یک NOP در پایپلاین حرکت می‌کند و هیچ عملیاتی در مراحل بعدی انجام نمی‌دهد.</w:t>
-      </w:r>
-    </w:p>
-    <w:p>
-      <w:pPr>
-        <w:bidi/>
-        <w:jc w:val="right"/>
-      </w:pPr>
-      <w:r>
-        <w:rPr>
-          <w:rtl/>
-        </w:rPr>
-        <w:t>با استفاده از این مکانیزم، دستورهای نادرستی که پس از یک Jump گرفته‌شده وارد پایپلاین شده بودند حذف می‌شوند و شمارنده برنامه (PC) از آدرس صحیح ادامه اجرا را دنبال می‌کند. به این ترتیب، منطق اجرای دستورهای کنترلی به‌درستی در پایپلاین پیاده‌سازی شده و از اجرای ناخواسته دستورات جلوگیری می‌شود. در طول پیاده‌سازی این بخش، چند اشکال (Bug) شناسایی و برطرف شد.</w:t>
-      </w:r>
-    </w:p>
-    <w:p>
-      <w:pPr>
-        <w:pStyle w:val="Heading1"/>
-        <w:bidi/>
-        <w:jc w:val="right"/>
-      </w:pPr>
-      <w:r>
-        <w:rPr>
-          <w:rFonts w:ascii="Arial" w:hAnsi="Arial"/>
-          <w:rtl/>
-        </w:rPr>
-        <w:t>۱۰. تست و ارزیابی عملکرد پردازنده</w:t>
-      </w:r>
-    </w:p>
-    <w:p>
-      <w:pPr>
-        <w:bidi/>
-        <w:jc w:val="right"/>
-      </w:pPr>
-      <w:r>
-        <w:rPr>
-          <w:rtl/>
-        </w:rPr>
-        <w:t>در این مرحله از پروژه تنها خط لوله پنج‌مرحله‌ای پردازنده پیاده‌سازی شده است و مکانیزم‌های Forwarding، Hazard Detection و Stall هنوز به معماری اضافه نشده‌اند. به همین دلیل، در تمامی تست‌هایی که وابستگی داده‌ای بین دستورات وجود دارد، از چهار دستور NOP استفاده شده است تا نتایج دستورات قبلی به مرحله Write Back (WB) رسیده و در بانک رجیسترها ثبت شوند. این روش امکان بررسی صحیح عملکرد واحدهای مختلف پردازنده را بدون تأثیر مخاطرات داده‌ای فراهم می‌کند.</w:t>
-      </w:r>
-    </w:p>
-    <w:p>
-      <w:pPr>
-        <w:pStyle w:val="Heading2"/>
-        <w:bidi/>
-        <w:jc w:val="right"/>
-      </w:pPr>
-      <w:r>
-        <w:rPr>
-          <w:rFonts w:ascii="Arial" w:hAnsi="Arial"/>
-          <w:rtl/>
-        </w:rPr>
-        <w:t>۱. تست عملکرد واحد ALU</w:t>
-      </w:r>
-    </w:p>
-    <w:p>
-      <w:pPr>
-        <w:bidi/>
-        <w:jc w:val="right"/>
-      </w:pPr>
-      <w:r>
-        <w:rPr>
-          <w:b/>
-          <w:rtl/>
-        </w:rPr>
-        <w:t>هدف تست:</w:t>
-      </w:r>
-    </w:p>
-    <w:p>
-      <w:pPr>
-        <w:bidi/>
-        <w:jc w:val="right"/>
-      </w:pPr>
-      <w:r>
-        <w:rPr>
-          <w:rtl/>
-        </w:rPr>
-        <w:t>بررسی صحت عملکرد واحد محاسبات و منطق (ALU) در اجرای دستورات محاسباتی و منطقی. در این بخش تمامی عملیات اصلی ALU شامل ADD, SUB, AND, OR, XOR, SLL, SRL, SLT, SLTU مورد بررسی قرار گرفتند.</w:t>
-      </w:r>
-    </w:p>
-    <w:p>
-      <w:pPr>
-        <w:bidi/>
-        <w:jc w:val="right"/>
-      </w:pPr>
-      <w:r>
-        <w:rPr>
-          <w:rtl/>
-        </w:rPr>
-        <w:t>از آنجا که در این مرحله از پروژه مکانیزم Forwarding و Hazard Detection پیاده‌سازی نشده است، بین مقداردهی اولیه رجیسترها و اجرای دستور وابسته، چهار دستور NOP قرار داده شده است تا داده‌ها فرصت کافی برای رسیدن به مرحله Write Back (WB) را داشته باشند و مقدار صحیح در بانک رجیسترها ذخیره شود.</w:t>
-      </w:r>
-    </w:p>
-    <w:p>
-      <w:pPr>
-        <w:bidi/>
-        <w:jc w:val="right"/>
-      </w:pPr>
-      <w:r>
-        <w:rPr>
-          <w:b/>
-          <w:rtl/>
-        </w:rPr>
-        <w:t>نمونه کد:</w:t>
-      </w:r>
-    </w:p>
-    <w:p>
-      <w:pPr>
-        <w:rPr>
-          <w:rFonts w:ascii="Courier New" w:hAnsi="Courier New"/>
-          <w:sz w:val="20"/>
-        </w:rPr>
-      </w:pPr>
-      <w:proofErr w:type="gramStart"/>
-      <w:r>
-        <w:rPr>
-          <w:rFonts w:ascii="Courier New" w:hAnsi="Courier New"/>
-          <w:sz w:val="20"/>
-        </w:rPr>
-        <w:t>.global</w:t>
-      </w:r>
-      <w:proofErr w:type="gramEnd"/>
-      <w:r>
-        <w:rPr>
-          <w:rFonts w:ascii="Courier New" w:hAnsi="Courier New"/>
-          <w:sz w:val="20"/>
-        </w:rPr>
-        <w:t xml:space="preserve"> _boot</w:t>
-      </w:r>
-      <w:r>
-        <w:rPr>
-          <w:rFonts w:ascii="Courier New" w:hAnsi="Courier New"/>
-          <w:sz w:val="20"/>
-        </w:rPr>
-        <w:br/>
-        <w:t>.text</w:t>
-      </w:r>
-      <w:r>
-        <w:rPr>
-          <w:rFonts w:ascii="Courier New" w:hAnsi="Courier New"/>
-          <w:sz w:val="20"/>
-        </w:rPr>
-        <w:br/>
-        <w:t>.option norvc</w:t>
-      </w:r>
-      <w:r>
-        <w:rPr>
-          <w:rFonts w:ascii="Courier New" w:hAnsi="Courier New"/>
-          <w:sz w:val="20"/>
-        </w:rPr>
-        <w:br/>
-      </w:r>
-      <w:r>
-        <w:rPr>
-          <w:rFonts w:ascii="Courier New" w:hAnsi="Courier New"/>
-          <w:sz w:val="20"/>
-        </w:rPr>
-        <w:br/>
-      </w:r>
-      <w:r>
-        <w:rPr>
-          <w:rFonts w:ascii="Courier New" w:hAnsi="Courier New"/>
-          <w:sz w:val="20"/>
-        </w:rPr>
-        <w:lastRenderedPageBreak/>
-        <w:t>_boot:</w:t>
-      </w:r>
-      <w:r>
-        <w:rPr>
-          <w:rFonts w:ascii="Courier New" w:hAnsi="Courier New"/>
-          <w:sz w:val="20"/>
-        </w:rPr>
-        <w:br/>
-        <w:t xml:space="preserve">    addi x1, x0, 10</w:t>
-      </w:r>
-      <w:r>
-        <w:rPr>
-          <w:rFonts w:ascii="Courier New" w:hAnsi="Courier New"/>
-          <w:sz w:val="20"/>
-        </w:rPr>
-        <w:br/>
-        <w:t xml:space="preserve">    addi x2, x0, 4</w:t>
-      </w:r>
-      <w:r>
-        <w:rPr>
-          <w:rFonts w:ascii="Courier New" w:hAnsi="Courier New"/>
-          <w:sz w:val="20"/>
-        </w:rPr>
-        <w:br/>
-      </w:r>
-      <w:r>
-        <w:rPr>
-          <w:rFonts w:ascii="Courier New" w:hAnsi="Courier New"/>
-          <w:sz w:val="20"/>
-        </w:rPr>
-        <w:br/>
-        <w:t xml:space="preserve">    nop</w:t>
-      </w:r>
-      <w:r>
-        <w:rPr>
-          <w:rFonts w:ascii="Courier New" w:hAnsi="Courier New"/>
-          <w:sz w:val="20"/>
-        </w:rPr>
-        <w:br/>
-        <w:t xml:space="preserve">    nop</w:t>
-      </w:r>
-      <w:r>
-        <w:rPr>
-          <w:rFonts w:ascii="Courier New" w:hAnsi="Courier New"/>
-          <w:sz w:val="20"/>
-        </w:rPr>
-        <w:br/>
-        <w:t xml:space="preserve">    nop</w:t>
-      </w:r>
-      <w:r>
-        <w:rPr>
-          <w:rFonts w:ascii="Courier New" w:hAnsi="Courier New"/>
-          <w:sz w:val="20"/>
-        </w:rPr>
-        <w:br/>
-        <w:t xml:space="preserve">    nop</w:t>
-      </w:r>
-      <w:r>
-        <w:rPr>
-          <w:rFonts w:ascii="Courier New" w:hAnsi="Courier New"/>
-          <w:sz w:val="20"/>
-        </w:rPr>
-        <w:br/>
-      </w:r>
-      <w:r>
-        <w:rPr>
-          <w:rFonts w:ascii="Courier New" w:hAnsi="Courier New"/>
-          <w:sz w:val="20"/>
-        </w:rPr>
-        <w:br/>
-        <w:t xml:space="preserve">    add x3, x1, x2</w:t>
-      </w:r>
-      <w:r>
-        <w:rPr>
-          <w:rFonts w:ascii="Courier New" w:hAnsi="Courier New"/>
-          <w:sz w:val="20"/>
-        </w:rPr>
-        <w:br/>
-      </w:r>
-      <w:r>
-        <w:rPr>
-          <w:rFonts w:ascii="Courier New" w:hAnsi="Courier New"/>
-          <w:sz w:val="20"/>
-        </w:rPr>
-        <w:br/>
-        <w:t>end:</w:t>
-      </w:r>
-      <w:r>
-        <w:rPr>
-          <w:rFonts w:ascii="Courier New" w:hAnsi="Courier New"/>
-          <w:sz w:val="20"/>
-        </w:rPr>
-        <w:br/>
-        <w:t xml:space="preserve">    </w:t>
-      </w:r>
-      <w:proofErr w:type="spellStart"/>
-      <w:r>
-        <w:rPr>
-          <w:rFonts w:ascii="Courier New" w:hAnsi="Courier New"/>
-          <w:sz w:val="20"/>
-        </w:rPr>
-        <w:t>beq</w:t>
-      </w:r>
-      <w:proofErr w:type="spellEnd"/>
-      <w:r>
-        <w:rPr>
-          <w:rFonts w:ascii="Courier New" w:hAnsi="Courier New"/>
-          <w:sz w:val="20"/>
-        </w:rPr>
-        <w:t xml:space="preserve"> x0, x0, end</w:t>
-      </w:r>
-    </w:p>
-    <w:p>
-      <w:pPr>
-        <w:bidi/>
-        <w:jc w:val="right"/>
-      </w:pPr>
-      <w:r>
-        <w:rPr>
-          <w:b/>
-          <w:rtl/>
-        </w:rPr>
-        <w:t>نتیجه مورد انتظار:</w:t>
-      </w:r>
-    </w:p>
-    <w:p>
-      <w:r>
-        <w:rPr>
-          <w:rFonts w:ascii="Courier New" w:hAnsi="Courier New"/>
-          <w:sz w:val="20"/>
-        </w:rPr>
-        <w:t>x1 = 10</w:t>
-      </w:r>
-      <w:r>
-        <w:rPr>
-          <w:rFonts w:ascii="Courier New" w:hAnsi="Courier New"/>
-          <w:sz w:val="20"/>
-        </w:rPr>
-        <w:br/>
-        <w:t>x2 = 4</w:t>
-      </w:r>
-      <w:r>
-        <w:rPr>
-          <w:rFonts w:ascii="Courier New" w:hAnsi="Courier New"/>
-          <w:sz w:val="20"/>
-        </w:rPr>
-        <w:br/>
-        <w:t>x3 = 14</w:t>
-      </w:r>
-    </w:p>
-    <w:p>
-      <w:pPr>
-        <w:bidi/>
-        <w:jc w:val="right"/>
-        <w:rPr>
-          <w:b/>
-          <w:rtl/>
-        </w:rPr>
-      </w:pPr>
-      <w:r>
-        <w:rPr>
-          <w:b/>
-          <w:rtl/>
-        </w:rPr>
-        <w:t>نتیجه:</w:t>
-      </w:r>
-    </w:p>
-    <w:p>
-      <w:pPr>
-        <w:bidi/>
-        <w:jc w:val="right"/>
-      </w:pPr>
-      <w:r>
-        <w:rPr>
           <w:rFonts w:cs="Arial"/>
+          <w:noProof/>
           <w:rtl/>
         </w:rPr>
         <w:drawing>
@@ -2263,7 +2255,6 @@
     <w:p>
       <w:pPr>
         <w:bidi/>
-        <w:jc w:val="right"/>
         <w:rPr>
           <w:rtl/>
         </w:rPr>
@@ -2290,7 +2281,6 @@
     <w:p>
       <w:pPr>
         <w:bidi/>
-        <w:jc w:val="right"/>
         <w:rPr>
           <w:rtl/>
         </w:rPr>
@@ -2298,6 +2288,7 @@
       <w:r>
         <w:rPr>
           <w:rFonts w:cs="Arial"/>
+          <w:noProof/>
           <w:rtl/>
         </w:rPr>
         <w:lastRenderedPageBreak/>
@@ -2348,7 +2339,6 @@
     <w:p>
       <w:pPr>
         <w:bidi/>
-        <w:jc w:val="right"/>
       </w:pPr>
       <w:r>
         <w:rPr>
@@ -2362,7 +2352,6 @@
       <w:pPr>
         <w:pStyle w:val="Heading2"/>
         <w:bidi/>
-        <w:jc w:val="right"/>
       </w:pPr>
       <w:r>
         <w:rPr>
@@ -2375,7 +2364,6 @@
     <w:p>
       <w:pPr>
         <w:bidi/>
-        <w:jc w:val="right"/>
       </w:pPr>
       <w:r>
         <w:rPr>
@@ -2388,13 +2376,156 @@
     <w:p>
       <w:pPr>
         <w:bidi/>
-        <w:jc w:val="right"/>
       </w:pPr>
       <w:r>
         <w:rPr>
           <w:rtl/>
         </w:rPr>
         <w:t>بررسی صحت عملکرد دستور BEQ در حالت Taken و اطمینان از تغییر صحیح مسیر اجرای برنامه. به دلیل نبود Forwarding، پیش از اجرای دستور Branch چهار دستور NOP قرار داده شده است تا مقادیر جدید رجیسترها در مرحله Write Back ثبت شوند.</w:t>
+      </w:r>
+    </w:p>
+    <w:p>
+      <w:pPr>
+        <w:bidi/>
+      </w:pPr>
+      <w:r>
+        <w:rPr>
+          <w:b/>
+          <w:rtl/>
+        </w:rPr>
+        <w:t>نمونه کد:</w:t>
+      </w:r>
+    </w:p>
+    <w:p>
+      <w:r>
+        <w:rPr>
+          <w:rFonts w:ascii="Courier New" w:hAnsi="Courier New"/>
+          <w:sz w:val="20"/>
+        </w:rPr>
+        <w:t>addi x1, x0, 5</w:t>
+      </w:r>
+      <w:r>
+        <w:rPr>
+          <w:rFonts w:ascii="Courier New" w:hAnsi="Courier New"/>
+          <w:sz w:val="20"/>
+        </w:rPr>
+        <w:br/>
+        <w:t>addi x2, x0, 5</w:t>
+      </w:r>
+      <w:r>
+        <w:rPr>
+          <w:rFonts w:ascii="Courier New" w:hAnsi="Courier New"/>
+          <w:sz w:val="20"/>
+        </w:rPr>
+        <w:br/>
+      </w:r>
+      <w:r>
+        <w:rPr>
+          <w:rFonts w:ascii="Courier New" w:hAnsi="Courier New"/>
+          <w:sz w:val="20"/>
+        </w:rPr>
+        <w:br/>
+        <w:t>nop</w:t>
+      </w:r>
+      <w:r>
+        <w:rPr>
+          <w:rFonts w:ascii="Courier New" w:hAnsi="Courier New"/>
+          <w:sz w:val="20"/>
+        </w:rPr>
+        <w:br/>
+        <w:t>nop</w:t>
+      </w:r>
+      <w:r>
+        <w:rPr>
+          <w:rFonts w:ascii="Courier New" w:hAnsi="Courier New"/>
+          <w:sz w:val="20"/>
+        </w:rPr>
+        <w:br/>
+        <w:t>nop</w:t>
+      </w:r>
+      <w:r>
+        <w:rPr>
+          <w:rFonts w:ascii="Courier New" w:hAnsi="Courier New"/>
+          <w:sz w:val="20"/>
+        </w:rPr>
+        <w:br/>
+        <w:t>nop</w:t>
+      </w:r>
+      <w:r>
+        <w:rPr>
+          <w:rFonts w:ascii="Courier New" w:hAnsi="Courier New"/>
+          <w:sz w:val="20"/>
+        </w:rPr>
+        <w:br/>
+      </w:r>
+      <w:r>
+        <w:rPr>
+          <w:rFonts w:ascii="Courier New" w:hAnsi="Courier New"/>
+          <w:sz w:val="20"/>
+        </w:rPr>
+        <w:br/>
+        <w:t>beq x1, x2, target</w:t>
+      </w:r>
+      <w:r>
+        <w:rPr>
+          <w:rFonts w:ascii="Courier New" w:hAnsi="Courier New"/>
+          <w:sz w:val="20"/>
+        </w:rPr>
+        <w:br/>
+      </w:r>
+      <w:r>
+        <w:rPr>
+          <w:rFonts w:ascii="Courier New" w:hAnsi="Courier New"/>
+          <w:sz w:val="20"/>
+        </w:rPr>
+        <w:br/>
+        <w:t>addi x3, x0, 111</w:t>
+      </w:r>
+      <w:r>
+        <w:rPr>
+          <w:rFonts w:ascii="Courier New" w:hAnsi="Courier New"/>
+          <w:sz w:val="20"/>
+        </w:rPr>
+        <w:br/>
+      </w:r>
+      <w:r>
+        <w:rPr>
+          <w:rFonts w:ascii="Courier New" w:hAnsi="Courier New"/>
+          <w:sz w:val="20"/>
+        </w:rPr>
+        <w:br/>
+        <w:t>target:</w:t>
+      </w:r>
+      <w:r>
+        <w:rPr>
+          <w:rFonts w:ascii="Courier New" w:hAnsi="Courier New"/>
+          <w:sz w:val="20"/>
+        </w:rPr>
+        <w:br/>
+        <w:t>addi x4, x0, 10</w:t>
+      </w:r>
+      <w:r>
+        <w:rPr>
+          <w:rFonts w:ascii="Courier New" w:hAnsi="Courier New"/>
+          <w:sz w:val="20"/>
+        </w:rPr>
+        <w:br/>
+      </w:r>
+      <w:r>
+        <w:rPr>
+          <w:rFonts w:ascii="Courier New" w:hAnsi="Courier New"/>
+          <w:sz w:val="20"/>
+        </w:rPr>
+        <w:br/>
+        <w:t>end:</w:t>
+      </w:r>
+      <w:r>
+        <w:rPr>
+          <w:rFonts w:ascii="Courier New" w:hAnsi="Courier New"/>
+          <w:sz w:val="20"/>
+        </w:rPr>
+        <w:br/>
+        <w:t>beq x0, x0, end</w:t>
       </w:r>
     </w:p>
     <w:p>
@@ -2407,7 +2538,7 @@
           <w:b/>
           <w:rtl/>
         </w:rPr>
-        <w:t>نمونه کد:</w:t>
+        <w:t>نتیجه مورد انتظار:</w:t>
       </w:r>
     </w:p>
     <w:p>
@@ -2416,7 +2547,8 @@
           <w:rFonts w:ascii="Courier New" w:hAnsi="Courier New"/>
           <w:sz w:val="20"/>
         </w:rPr>
-        <w:t>addi x1, x0, 5</w:t>
+        <w:lastRenderedPageBreak/>
+        <w:t>x1 = 5</w:t>
       </w:r>
       <w:r>
         <w:rPr>
@@ -2424,7 +2556,7 @@
           <w:sz w:val="20"/>
         </w:rPr>
         <w:br/>
-        <w:t>addi x2, x0, 5</w:t>
+        <w:t>x2 = 5</w:t>
       </w:r>
       <w:r>
         <w:rPr>
@@ -2432,6 +2564,7 @@
           <w:sz w:val="20"/>
         </w:rPr>
         <w:br/>
+        <w:t>x3 = 0</w:t>
       </w:r>
       <w:r>
         <w:rPr>
@@ -2439,179 +2572,35 @@
           <w:sz w:val="20"/>
         </w:rPr>
         <w:br/>
-        <w:t>nop</w:t>
-      </w:r>
-      <w:r>
-        <w:rPr>
-          <w:rFonts w:ascii="Courier New" w:hAnsi="Courier New"/>
-          <w:sz w:val="20"/>
-        </w:rPr>
-        <w:br/>
-        <w:t>nop</w:t>
-      </w:r>
-      <w:r>
-        <w:rPr>
-          <w:rFonts w:ascii="Courier New" w:hAnsi="Courier New"/>
-          <w:sz w:val="20"/>
-        </w:rPr>
-        <w:br/>
-        <w:t>nop</w:t>
-      </w:r>
-      <w:r>
-        <w:rPr>
-          <w:rFonts w:ascii="Courier New" w:hAnsi="Courier New"/>
-          <w:sz w:val="20"/>
-        </w:rPr>
-        <w:br/>
-        <w:t>nop</w:t>
-      </w:r>
-      <w:r>
-        <w:rPr>
-          <w:rFonts w:ascii="Courier New" w:hAnsi="Courier New"/>
-          <w:sz w:val="20"/>
-        </w:rPr>
-        <w:br/>
-      </w:r>
-      <w:r>
-        <w:rPr>
-          <w:rFonts w:ascii="Courier New" w:hAnsi="Courier New"/>
-          <w:sz w:val="20"/>
-        </w:rPr>
-        <w:br/>
-        <w:t>beq x1, x2, target</w:t>
-      </w:r>
-      <w:r>
-        <w:rPr>
-          <w:rFonts w:ascii="Courier New" w:hAnsi="Courier New"/>
-          <w:sz w:val="20"/>
-        </w:rPr>
-        <w:br/>
-      </w:r>
-      <w:r>
-        <w:rPr>
-          <w:rFonts w:ascii="Courier New" w:hAnsi="Courier New"/>
-          <w:sz w:val="20"/>
-        </w:rPr>
-        <w:br/>
-        <w:t>addi x3, x0, 111</w:t>
-      </w:r>
-      <w:r>
-        <w:rPr>
-          <w:rFonts w:ascii="Courier New" w:hAnsi="Courier New"/>
-          <w:sz w:val="20"/>
-        </w:rPr>
-        <w:br/>
-      </w:r>
-      <w:r>
-        <w:rPr>
-          <w:rFonts w:ascii="Courier New" w:hAnsi="Courier New"/>
-          <w:sz w:val="20"/>
-        </w:rPr>
-        <w:br/>
-        <w:t>target:</w:t>
-      </w:r>
-      <w:r>
-        <w:rPr>
-          <w:rFonts w:ascii="Courier New" w:hAnsi="Courier New"/>
-          <w:sz w:val="20"/>
-        </w:rPr>
-        <w:br/>
-        <w:t>addi x4, x0, 10</w:t>
-      </w:r>
-      <w:r>
-        <w:rPr>
-          <w:rFonts w:ascii="Courier New" w:hAnsi="Courier New"/>
-          <w:sz w:val="20"/>
-        </w:rPr>
-        <w:br/>
-      </w:r>
-      <w:r>
-        <w:rPr>
-          <w:rFonts w:ascii="Courier New" w:hAnsi="Courier New"/>
-          <w:sz w:val="20"/>
-        </w:rPr>
-        <w:br/>
-        <w:t>end:</w:t>
-      </w:r>
-      <w:r>
-        <w:rPr>
-          <w:rFonts w:ascii="Courier New" w:hAnsi="Courier New"/>
-          <w:sz w:val="20"/>
-        </w:rPr>
-        <w:br/>
-        <w:t>beq x0, x0, end</w:t>
+        <w:t>x4 = 10</w:t>
       </w:r>
     </w:p>
     <w:p>
       <w:pPr>
         <w:bidi/>
         <w:jc w:val="right"/>
-      </w:pPr>
-      <w:r>
         <w:rPr>
           <w:b/>
           <w:rtl/>
         </w:rPr>
-        <w:t>نتیجه مورد انتظار:</w:t>
-      </w:r>
-    </w:p>
-    <w:p>
-      <w:r>
-        <w:rPr>
-          <w:rFonts w:ascii="Courier New" w:hAnsi="Courier New"/>
-          <w:sz w:val="20"/>
-        </w:rPr>
-        <w:lastRenderedPageBreak/>
-        <w:t>x1 = 5</w:t>
-      </w:r>
-      <w:r>
-        <w:rPr>
-          <w:rFonts w:ascii="Courier New" w:hAnsi="Courier New"/>
-          <w:sz w:val="20"/>
-        </w:rPr>
-        <w:br/>
-        <w:t>x2 = 5</w:t>
-      </w:r>
-      <w:r>
-        <w:rPr>
-          <w:rFonts w:ascii="Courier New" w:hAnsi="Courier New"/>
-          <w:sz w:val="20"/>
-        </w:rPr>
-        <w:br/>
-        <w:t>x3 = 0</w:t>
-      </w:r>
-      <w:r>
-        <w:rPr>
-          <w:rFonts w:ascii="Courier New" w:hAnsi="Courier New"/>
-          <w:sz w:val="20"/>
-        </w:rPr>
-        <w:br/>
-        <w:t>x4 = 10</w:t>
+      </w:pPr>
+      <w:r>
+        <w:rPr>
+          <w:b/>
+          <w:rtl/>
+        </w:rPr>
+        <w:t>نتیجه:</w:t>
       </w:r>
     </w:p>
     <w:p>
       <w:pPr>
         <w:bidi/>
         <w:jc w:val="right"/>
-        <w:rPr>
-          <w:b/>
-          <w:rtl/>
-        </w:rPr>
-      </w:pPr>
-      <w:r>
-        <w:rPr>
-          <w:b/>
-          <w:rtl/>
-        </w:rPr>
-        <w:t>نتیجه:</w:t>
-      </w:r>
-    </w:p>
-    <w:p>
-      <w:pPr>
-        <w:bidi/>
-        <w:jc w:val="right"/>
-      </w:pPr>
-      <w:r>
+      </w:pPr>
+      <w:r>
+        <w:rPr>
+          <w:noProof/>
+        </w:rPr>
         <w:drawing>
           <wp:inline distT="0" distB="0" distL="0" distR="0" wp14:anchorId="78679007" wp14:editId="0B441B7A">
             <wp:extent cx="5486400" cy="3105785"/>
@@ -2671,7 +2660,6 @@
     <w:p>
       <w:pPr>
         <w:bidi/>
-        <w:jc w:val="right"/>
       </w:pPr>
       <w:r>
         <w:rPr>
@@ -2684,7 +2672,6 @@
       <w:pPr>
         <w:pStyle w:val="Heading2"/>
         <w:bidi/>
-        <w:jc w:val="right"/>
       </w:pPr>
       <w:r>
         <w:rPr>
@@ -2697,7 +2684,6 @@
     <w:p>
       <w:pPr>
         <w:bidi/>
-        <w:jc w:val="right"/>
       </w:pPr>
       <w:r>
         <w:rPr>
@@ -2710,7 +2696,6 @@
     <w:p>
       <w:pPr>
         <w:bidi/>
-        <w:jc w:val="right"/>
       </w:pPr>
       <w:r>
         <w:rPr>
@@ -2722,7 +2707,6 @@
     <w:p>
       <w:pPr>
         <w:bidi/>
-        <w:jc w:val="right"/>
       </w:pPr>
       <w:r>
         <w:rPr>
@@ -2883,7 +2867,6 @@
     <w:p>
       <w:pPr>
         <w:bidi/>
-        <w:jc w:val="right"/>
       </w:pPr>
       <w:r>
         <w:rPr>
@@ -2896,7 +2879,6 @@
       <w:pPr>
         <w:pStyle w:val="Heading2"/>
         <w:bidi/>
-        <w:jc w:val="right"/>
       </w:pPr>
       <w:r>
         <w:rPr>
@@ -2909,7 +2891,6 @@
     <w:p>
       <w:pPr>
         <w:bidi/>
-        <w:jc w:val="right"/>
       </w:pPr>
       <w:r>
         <w:rPr>
@@ -2922,13 +2903,134 @@
     <w:p>
       <w:pPr>
         <w:bidi/>
-        <w:jc w:val="right"/>
       </w:pPr>
       <w:r>
         <w:rPr>
           <w:rtl/>
         </w:rPr>
         <w:t>بررسی عملکرد صحیح دستور JAL و اطمینان از انتقال صحیح کنترل برنامه به آدرس مقصد.</w:t>
+      </w:r>
+    </w:p>
+    <w:p>
+      <w:pPr>
+        <w:bidi/>
+      </w:pPr>
+      <w:r>
+        <w:rPr>
+          <w:b/>
+          <w:rtl/>
+        </w:rPr>
+        <w:t>نمونه کد:</w:t>
+      </w:r>
+    </w:p>
+    <w:p>
+      <w:r>
+        <w:rPr>
+          <w:rFonts w:ascii="Courier New" w:hAnsi="Courier New"/>
+          <w:sz w:val="20"/>
+        </w:rPr>
+        <w:t>.global _boot</w:t>
+      </w:r>
+      <w:r>
+        <w:rPr>
+          <w:rFonts w:ascii="Courier New" w:hAnsi="Courier New"/>
+          <w:sz w:val="20"/>
+        </w:rPr>
+        <w:br/>
+        <w:t>.text</w:t>
+      </w:r>
+      <w:r>
+        <w:rPr>
+          <w:rFonts w:ascii="Courier New" w:hAnsi="Courier New"/>
+          <w:sz w:val="20"/>
+        </w:rPr>
+        <w:br/>
+        <w:t>.option norvc</w:t>
+      </w:r>
+      <w:r>
+        <w:rPr>
+          <w:rFonts w:ascii="Courier New" w:hAnsi="Courier New"/>
+          <w:sz w:val="20"/>
+        </w:rPr>
+        <w:br/>
+      </w:r>
+      <w:r>
+        <w:rPr>
+          <w:rFonts w:ascii="Courier New" w:hAnsi="Courier New"/>
+          <w:sz w:val="20"/>
+        </w:rPr>
+        <w:br/>
+        <w:t>_boot:</w:t>
+      </w:r>
+      <w:r>
+        <w:rPr>
+          <w:rFonts w:ascii="Courier New" w:hAnsi="Courier New"/>
+          <w:sz w:val="20"/>
+        </w:rPr>
+        <w:br/>
+        <w:t xml:space="preserve">    addi x1,x0,1</w:t>
+      </w:r>
+      <w:r>
+        <w:rPr>
+          <w:rFonts w:ascii="Courier New" w:hAnsi="Courier New"/>
+          <w:sz w:val="20"/>
+        </w:rPr>
+        <w:br/>
+        <w:t xml:space="preserve">    jal x0,L1</w:t>
+      </w:r>
+      <w:r>
+        <w:rPr>
+          <w:rFonts w:ascii="Courier New" w:hAnsi="Courier New"/>
+          <w:sz w:val="20"/>
+        </w:rPr>
+        <w:br/>
+        <w:t xml:space="preserve">    addi x2,x0,99</w:t>
+      </w:r>
+      <w:r>
+        <w:rPr>
+          <w:rFonts w:ascii="Courier New" w:hAnsi="Courier New"/>
+          <w:sz w:val="20"/>
+        </w:rPr>
+        <w:br/>
+      </w:r>
+      <w:r>
+        <w:rPr>
+          <w:rFonts w:ascii="Courier New" w:hAnsi="Courier New"/>
+          <w:sz w:val="20"/>
+        </w:rPr>
+        <w:br/>
+        <w:t>L1:</w:t>
+      </w:r>
+      <w:r>
+        <w:rPr>
+          <w:rFonts w:ascii="Courier New" w:hAnsi="Courier New"/>
+          <w:sz w:val="20"/>
+        </w:rPr>
+        <w:br/>
+        <w:t xml:space="preserve">    addi x3,x0,3</w:t>
+      </w:r>
+      <w:r>
+        <w:rPr>
+          <w:rFonts w:ascii="Courier New" w:hAnsi="Courier New"/>
+          <w:sz w:val="20"/>
+        </w:rPr>
+        <w:br/>
+      </w:r>
+      <w:r>
+        <w:rPr>
+          <w:rFonts w:ascii="Courier New" w:hAnsi="Courier New"/>
+          <w:sz w:val="20"/>
+        </w:rPr>
+        <w:br/>
+        <w:t>end:</w:t>
+      </w:r>
+      <w:r>
+        <w:rPr>
+          <w:rFonts w:ascii="Courier New" w:hAnsi="Courier New"/>
+          <w:sz w:val="20"/>
+        </w:rPr>
+        <w:br/>
+        <w:t xml:space="preserve">    beq x0,x0,end</w:t>
       </w:r>
     </w:p>
     <w:p>
@@ -2941,7 +3043,7 @@
           <w:b/>
           <w:rtl/>
         </w:rPr>
-        <w:t>نمونه کد:</w:t>
+        <w:t>نتیجه مورد انتظار:</w:t>
       </w:r>
     </w:p>
     <w:p>
@@ -2950,7 +3052,7 @@
           <w:rFonts w:ascii="Courier New" w:hAnsi="Courier New"/>
           <w:sz w:val="20"/>
         </w:rPr>
-        <w:t>.global _boot</w:t>
+        <w:t>x1 = 1</w:t>
       </w:r>
       <w:r>
         <w:rPr>
@@ -2958,7 +3060,7 @@
           <w:sz w:val="20"/>
         </w:rPr>
         <w:br/>
-        <w:t>.text</w:t>
+        <w:t>x2 = 0</w:t>
       </w:r>
       <w:r>
         <w:rPr>
@@ -2966,155 +3068,35 @@
           <w:sz w:val="20"/>
         </w:rPr>
         <w:br/>
-        <w:t>.option norvc</w:t>
-      </w:r>
-      <w:r>
-        <w:rPr>
-          <w:rFonts w:ascii="Courier New" w:hAnsi="Courier New"/>
-          <w:sz w:val="20"/>
-        </w:rPr>
-        <w:br/>
-      </w:r>
-      <w:r>
-        <w:rPr>
-          <w:rFonts w:ascii="Courier New" w:hAnsi="Courier New"/>
-          <w:sz w:val="20"/>
-        </w:rPr>
-        <w:br/>
-        <w:t>_boot:</w:t>
-      </w:r>
-      <w:r>
-        <w:rPr>
-          <w:rFonts w:ascii="Courier New" w:hAnsi="Courier New"/>
-          <w:sz w:val="20"/>
-        </w:rPr>
-        <w:br/>
-        <w:t xml:space="preserve">    addi x1,x0,1</w:t>
-      </w:r>
-      <w:r>
-        <w:rPr>
-          <w:rFonts w:ascii="Courier New" w:hAnsi="Courier New"/>
-          <w:sz w:val="20"/>
-        </w:rPr>
-        <w:br/>
-        <w:t xml:space="preserve">    jal x0,L1</w:t>
-      </w:r>
-      <w:r>
-        <w:rPr>
-          <w:rFonts w:ascii="Courier New" w:hAnsi="Courier New"/>
-          <w:sz w:val="20"/>
-        </w:rPr>
-        <w:br/>
-        <w:t xml:space="preserve">    addi x2,x0,99</w:t>
-      </w:r>
-      <w:r>
-        <w:rPr>
-          <w:rFonts w:ascii="Courier New" w:hAnsi="Courier New"/>
-          <w:sz w:val="20"/>
-        </w:rPr>
-        <w:br/>
-      </w:r>
-      <w:r>
-        <w:rPr>
-          <w:rFonts w:ascii="Courier New" w:hAnsi="Courier New"/>
-          <w:sz w:val="20"/>
-        </w:rPr>
-        <w:br/>
-        <w:t>L1:</w:t>
-      </w:r>
-      <w:r>
-        <w:rPr>
-          <w:rFonts w:ascii="Courier New" w:hAnsi="Courier New"/>
-          <w:sz w:val="20"/>
-        </w:rPr>
-        <w:br/>
-        <w:t xml:space="preserve">    addi x3,x0,3</w:t>
-      </w:r>
-      <w:r>
-        <w:rPr>
-          <w:rFonts w:ascii="Courier New" w:hAnsi="Courier New"/>
-          <w:sz w:val="20"/>
-        </w:rPr>
-        <w:br/>
-      </w:r>
-      <w:r>
-        <w:rPr>
-          <w:rFonts w:ascii="Courier New" w:hAnsi="Courier New"/>
-          <w:sz w:val="20"/>
-        </w:rPr>
-        <w:br/>
-        <w:t>end:</w:t>
-      </w:r>
-      <w:r>
-        <w:rPr>
-          <w:rFonts w:ascii="Courier New" w:hAnsi="Courier New"/>
-          <w:sz w:val="20"/>
-        </w:rPr>
-        <w:br/>
-        <w:t xml:space="preserve">    beq x0,x0,end</w:t>
+        <w:t>x3 = 3</w:t>
       </w:r>
     </w:p>
     <w:p>
       <w:pPr>
         <w:bidi/>
         <w:jc w:val="right"/>
-      </w:pPr>
-      <w:r>
         <w:rPr>
           <w:b/>
           <w:rtl/>
         </w:rPr>
-        <w:t>نتیجه مورد انتظار:</w:t>
-      </w:r>
-    </w:p>
-    <w:p>
-      <w:r>
-        <w:rPr>
-          <w:rFonts w:ascii="Courier New" w:hAnsi="Courier New"/>
-          <w:sz w:val="20"/>
-        </w:rPr>
-        <w:t>x1 = 1</w:t>
-      </w:r>
-      <w:r>
-        <w:rPr>
-          <w:rFonts w:ascii="Courier New" w:hAnsi="Courier New"/>
-          <w:sz w:val="20"/>
-        </w:rPr>
-        <w:br/>
-        <w:t>x2 = 0</w:t>
-      </w:r>
-      <w:r>
-        <w:rPr>
-          <w:rFonts w:ascii="Courier New" w:hAnsi="Courier New"/>
-          <w:sz w:val="20"/>
-        </w:rPr>
-        <w:br/>
-        <w:t>x3 = 3</w:t>
+      </w:pPr>
+      <w:r>
+        <w:rPr>
+          <w:b/>
+          <w:rtl/>
+        </w:rPr>
+        <w:t>نتیجه:</w:t>
       </w:r>
     </w:p>
     <w:p>
       <w:pPr>
         <w:bidi/>
         <w:jc w:val="right"/>
-        <w:rPr>
-          <w:b/>
-          <w:rtl/>
-        </w:rPr>
-      </w:pPr>
-      <w:r>
-        <w:rPr>
-          <w:b/>
-          <w:rtl/>
-        </w:rPr>
-        <w:t>نتیجه:</w:t>
-      </w:r>
-    </w:p>
-    <w:p>
-      <w:pPr>
-        <w:bidi/>
-        <w:jc w:val="right"/>
-      </w:pPr>
-      <w:r>
+      </w:pPr>
+      <w:r>
+        <w:rPr>
+          <w:noProof/>
+        </w:rPr>
         <w:lastRenderedPageBreak/>
         <w:drawing>
           <wp:inline distT="0" distB="0" distL="0" distR="0" wp14:anchorId="28C00C4F" wp14:editId="6D461CC9">
@@ -3175,7 +3157,6 @@
     <w:p>
       <w:pPr>
         <w:bidi/>
-        <w:jc w:val="right"/>
       </w:pPr>
       <w:r>
         <w:rPr>
@@ -3188,7 +3169,6 @@
       <w:pPr>
         <w:pStyle w:val="Heading2"/>
         <w:bidi/>
-        <w:jc w:val="right"/>
       </w:pPr>
       <w:r>
         <w:rPr>
@@ -3201,7 +3181,6 @@
     <w:p>
       <w:pPr>
         <w:bidi/>
-        <w:jc w:val="right"/>
       </w:pPr>
       <w:r>
         <w:rPr>
@@ -3214,13 +3193,195 @@
     <w:p>
       <w:pPr>
         <w:bidi/>
-        <w:jc w:val="right"/>
       </w:pPr>
       <w:r>
         <w:rPr>
           <w:rtl/>
         </w:rPr>
         <w:t>بررسی این موضوع که اولین دستور موجود در مقصد Jump بدون خطا اجرا شود و همچنین دستورات قرار گرفته بین Jump و مقصد نادیده گرفته شوند.</w:t>
+      </w:r>
+    </w:p>
+    <w:p>
+      <w:pPr>
+        <w:bidi/>
+      </w:pPr>
+      <w:r>
+        <w:rPr>
+          <w:b/>
+          <w:rtl/>
+        </w:rPr>
+        <w:t>نمونه کد:</w:t>
+      </w:r>
+    </w:p>
+    <w:p>
+      <w:r>
+        <w:rPr>
+          <w:rFonts w:ascii="Courier New" w:hAnsi="Courier New"/>
+          <w:sz w:val="20"/>
+        </w:rPr>
+        <w:t>.global _boot</w:t>
+      </w:r>
+      <w:r>
+        <w:rPr>
+          <w:rFonts w:ascii="Courier New" w:hAnsi="Courier New"/>
+          <w:sz w:val="20"/>
+        </w:rPr>
+        <w:br/>
+        <w:t>.text</w:t>
+      </w:r>
+      <w:r>
+        <w:rPr>
+          <w:rFonts w:ascii="Courier New" w:hAnsi="Courier New"/>
+          <w:sz w:val="20"/>
+        </w:rPr>
+        <w:br/>
+        <w:t>.option norvc</w:t>
+      </w:r>
+      <w:r>
+        <w:rPr>
+          <w:rFonts w:ascii="Courier New" w:hAnsi="Courier New"/>
+          <w:sz w:val="20"/>
+        </w:rPr>
+        <w:br/>
+      </w:r>
+      <w:r>
+        <w:rPr>
+          <w:rFonts w:ascii="Courier New" w:hAnsi="Courier New"/>
+          <w:sz w:val="20"/>
+        </w:rPr>
+        <w:br/>
+        <w:t>_boot:</w:t>
+      </w:r>
+      <w:r>
+        <w:rPr>
+          <w:rFonts w:ascii="Courier New" w:hAnsi="Courier New"/>
+          <w:sz w:val="20"/>
+        </w:rPr>
+        <w:br/>
+        <w:t xml:space="preserve">    addi x1,  x0, 0</w:t>
+      </w:r>
+      <w:r>
+        <w:rPr>
+          <w:rFonts w:ascii="Courier New" w:hAnsi="Courier New"/>
+          <w:sz w:val="20"/>
+        </w:rPr>
+        <w:br/>
+        <w:t xml:space="preserve">    addi x2,  x0, 0</w:t>
+      </w:r>
+      <w:r>
+        <w:rPr>
+          <w:rFonts w:ascii="Courier New" w:hAnsi="Courier New"/>
+          <w:sz w:val="20"/>
+        </w:rPr>
+        <w:br/>
+        <w:t xml:space="preserve">    addi x3,  x0, 0</w:t>
+      </w:r>
+      <w:r>
+        <w:rPr>
+          <w:rFonts w:ascii="Courier New" w:hAnsi="Courier New"/>
+          <w:sz w:val="20"/>
+        </w:rPr>
+        <w:br/>
+        <w:t xml:space="preserve">    addi x10, x0, 0</w:t>
+      </w:r>
+      <w:r>
+        <w:rPr>
+          <w:rFonts w:ascii="Courier New" w:hAnsi="Courier New"/>
+          <w:sz w:val="20"/>
+        </w:rPr>
+        <w:br/>
+      </w:r>
+      <w:r>
+        <w:rPr>
+          <w:rFonts w:ascii="Courier New" w:hAnsi="Courier New"/>
+          <w:sz w:val="20"/>
+        </w:rPr>
+        <w:br/>
+        <w:t xml:space="preserve">    jal x0, target</w:t>
+      </w:r>
+      <w:r>
+        <w:rPr>
+          <w:rFonts w:ascii="Courier New" w:hAnsi="Courier New"/>
+          <w:sz w:val="20"/>
+        </w:rPr>
+        <w:br/>
+      </w:r>
+      <w:r>
+        <w:rPr>
+          <w:rFonts w:ascii="Courier New" w:hAnsi="Courier New"/>
+          <w:sz w:val="20"/>
+        </w:rPr>
+        <w:br/>
+        <w:t xml:space="preserve">    addi x1, x0, 1</w:t>
+      </w:r>
+      <w:r>
+        <w:rPr>
+          <w:rFonts w:ascii="Courier New" w:hAnsi="Courier New"/>
+          <w:sz w:val="20"/>
+        </w:rPr>
+        <w:br/>
+        <w:t xml:space="preserve">    addi x2, x0, 2</w:t>
+      </w:r>
+      <w:r>
+        <w:rPr>
+          <w:rFonts w:ascii="Courier New" w:hAnsi="Courier New"/>
+          <w:sz w:val="20"/>
+        </w:rPr>
+        <w:br/>
+        <w:t xml:space="preserve">    addi x3, x0, 3</w:t>
+      </w:r>
+      <w:r>
+        <w:rPr>
+          <w:rFonts w:ascii="Courier New" w:hAnsi="Courier New"/>
+          <w:sz w:val="20"/>
+        </w:rPr>
+        <w:br/>
+      </w:r>
+      <w:r>
+        <w:rPr>
+          <w:rFonts w:ascii="Courier New" w:hAnsi="Courier New"/>
+          <w:sz w:val="20"/>
+        </w:rPr>
+        <w:br/>
+        <w:t>target:</w:t>
+      </w:r>
+      <w:r>
+        <w:rPr>
+          <w:rFonts w:ascii="Courier New" w:hAnsi="Courier New"/>
+          <w:sz w:val="20"/>
+        </w:rPr>
+        <w:br/>
+      </w:r>
+      <w:r>
+        <w:rPr>
+          <w:rFonts w:ascii="Courier New" w:hAnsi="Courier New"/>
+          <w:sz w:val="20"/>
+        </w:rPr>
+        <w:lastRenderedPageBreak/>
+        <w:t xml:space="preserve">    addi x10, x0, 10</w:t>
+      </w:r>
+      <w:r>
+        <w:rPr>
+          <w:rFonts w:ascii="Courier New" w:hAnsi="Courier New"/>
+          <w:sz w:val="20"/>
+        </w:rPr>
+        <w:br/>
+      </w:r>
+      <w:r>
+        <w:rPr>
+          <w:rFonts w:ascii="Courier New" w:hAnsi="Courier New"/>
+          <w:sz w:val="20"/>
+        </w:rPr>
+        <w:br/>
+        <w:t>end:</w:t>
+      </w:r>
+      <w:r>
+        <w:rPr>
+          <w:rFonts w:ascii="Courier New" w:hAnsi="Courier New"/>
+          <w:sz w:val="20"/>
+        </w:rPr>
+        <w:br/>
+        <w:t xml:space="preserve">    beq x0, x0, end</w:t>
       </w:r>
     </w:p>
     <w:p>
@@ -3233,7 +3394,7 @@
           <w:b/>
           <w:rtl/>
         </w:rPr>
-        <w:t>نمونه کد:</w:t>
+        <w:t>نتیجه مورد انتظار:</w:t>
       </w:r>
     </w:p>
     <w:p>
@@ -3242,7 +3403,7 @@
           <w:rFonts w:ascii="Courier New" w:hAnsi="Courier New"/>
           <w:sz w:val="20"/>
         </w:rPr>
-        <w:t>.global _boot</w:t>
+        <w:t>x1 = 0</w:t>
       </w:r>
       <w:r>
         <w:rPr>
@@ -3250,7 +3411,7 @@
           <w:sz w:val="20"/>
         </w:rPr>
         <w:br/>
-        <w:t>.text</w:t>
+        <w:t>x2 = 0</w:t>
       </w:r>
       <w:r>
         <w:rPr>
@@ -3258,7 +3419,7 @@
           <w:sz w:val="20"/>
         </w:rPr>
         <w:br/>
-        <w:t>.option norvc</w:t>
+        <w:t>x3 = 0</w:t>
       </w:r>
       <w:r>
         <w:rPr>
@@ -3266,216 +3427,35 @@
           <w:sz w:val="20"/>
         </w:rPr>
         <w:br/>
-      </w:r>
-      <w:r>
-        <w:rPr>
-          <w:rFonts w:ascii="Courier New" w:hAnsi="Courier New"/>
-          <w:sz w:val="20"/>
-        </w:rPr>
-        <w:br/>
-        <w:t>_boot:</w:t>
-      </w:r>
-      <w:r>
-        <w:rPr>
-          <w:rFonts w:ascii="Courier New" w:hAnsi="Courier New"/>
-          <w:sz w:val="20"/>
-        </w:rPr>
-        <w:br/>
-        <w:t xml:space="preserve">    addi x1,  x0, 0</w:t>
-      </w:r>
-      <w:r>
-        <w:rPr>
-          <w:rFonts w:ascii="Courier New" w:hAnsi="Courier New"/>
-          <w:sz w:val="20"/>
-        </w:rPr>
-        <w:br/>
-        <w:t xml:space="preserve">    addi x2,  x0, 0</w:t>
-      </w:r>
-      <w:r>
-        <w:rPr>
-          <w:rFonts w:ascii="Courier New" w:hAnsi="Courier New"/>
-          <w:sz w:val="20"/>
-        </w:rPr>
-        <w:br/>
-        <w:t xml:space="preserve">    addi x3,  x0, 0</w:t>
-      </w:r>
-      <w:r>
-        <w:rPr>
-          <w:rFonts w:ascii="Courier New" w:hAnsi="Courier New"/>
-          <w:sz w:val="20"/>
-        </w:rPr>
-        <w:br/>
-        <w:t xml:space="preserve">    addi x10, x0, 0</w:t>
-      </w:r>
-      <w:r>
-        <w:rPr>
-          <w:rFonts w:ascii="Courier New" w:hAnsi="Courier New"/>
-          <w:sz w:val="20"/>
-        </w:rPr>
-        <w:br/>
-      </w:r>
-      <w:r>
-        <w:rPr>
-          <w:rFonts w:ascii="Courier New" w:hAnsi="Courier New"/>
-          <w:sz w:val="20"/>
-        </w:rPr>
-        <w:br/>
-        <w:t xml:space="preserve">    jal x0, target</w:t>
-      </w:r>
-      <w:r>
-        <w:rPr>
-          <w:rFonts w:ascii="Courier New" w:hAnsi="Courier New"/>
-          <w:sz w:val="20"/>
-        </w:rPr>
-        <w:br/>
-      </w:r>
-      <w:r>
-        <w:rPr>
-          <w:rFonts w:ascii="Courier New" w:hAnsi="Courier New"/>
-          <w:sz w:val="20"/>
-        </w:rPr>
-        <w:br/>
-        <w:t xml:space="preserve">    addi x1, x0, 1</w:t>
-      </w:r>
-      <w:r>
-        <w:rPr>
-          <w:rFonts w:ascii="Courier New" w:hAnsi="Courier New"/>
-          <w:sz w:val="20"/>
-        </w:rPr>
-        <w:br/>
-        <w:t xml:space="preserve">    addi x2, x0, 2</w:t>
-      </w:r>
-      <w:r>
-        <w:rPr>
-          <w:rFonts w:ascii="Courier New" w:hAnsi="Courier New"/>
-          <w:sz w:val="20"/>
-        </w:rPr>
-        <w:br/>
-        <w:t xml:space="preserve">    addi x3, x0, 3</w:t>
-      </w:r>
-      <w:r>
-        <w:rPr>
-          <w:rFonts w:ascii="Courier New" w:hAnsi="Courier New"/>
-          <w:sz w:val="20"/>
-        </w:rPr>
-        <w:br/>
-      </w:r>
-      <w:r>
-        <w:rPr>
-          <w:rFonts w:ascii="Courier New" w:hAnsi="Courier New"/>
-          <w:sz w:val="20"/>
-        </w:rPr>
-        <w:br/>
-        <w:t>target:</w:t>
-      </w:r>
-      <w:r>
-        <w:rPr>
-          <w:rFonts w:ascii="Courier New" w:hAnsi="Courier New"/>
-          <w:sz w:val="20"/>
-        </w:rPr>
-        <w:br/>
-      </w:r>
-      <w:r>
-        <w:rPr>
-          <w:rFonts w:ascii="Courier New" w:hAnsi="Courier New"/>
-          <w:sz w:val="20"/>
-        </w:rPr>
-        <w:lastRenderedPageBreak/>
-        <w:t xml:space="preserve">    addi x10, x0, 10</w:t>
-      </w:r>
-      <w:r>
-        <w:rPr>
-          <w:rFonts w:ascii="Courier New" w:hAnsi="Courier New"/>
-          <w:sz w:val="20"/>
-        </w:rPr>
-        <w:br/>
-      </w:r>
-      <w:r>
-        <w:rPr>
-          <w:rFonts w:ascii="Courier New" w:hAnsi="Courier New"/>
-          <w:sz w:val="20"/>
-        </w:rPr>
-        <w:br/>
-        <w:t>end:</w:t>
-      </w:r>
-      <w:r>
-        <w:rPr>
-          <w:rFonts w:ascii="Courier New" w:hAnsi="Courier New"/>
-          <w:sz w:val="20"/>
-        </w:rPr>
-        <w:br/>
-        <w:t xml:space="preserve">    beq x0, x0, end</w:t>
+        <w:t>x10 = 10</w:t>
       </w:r>
     </w:p>
     <w:p>
       <w:pPr>
         <w:bidi/>
         <w:jc w:val="right"/>
-      </w:pPr>
-      <w:r>
         <w:rPr>
           <w:b/>
           <w:rtl/>
         </w:rPr>
-        <w:t>نتیجه مورد انتظار:</w:t>
-      </w:r>
-    </w:p>
-    <w:p>
-      <w:r>
-        <w:rPr>
-          <w:rFonts w:ascii="Courier New" w:hAnsi="Courier New"/>
-          <w:sz w:val="20"/>
-        </w:rPr>
-        <w:t>x1 = 0</w:t>
-      </w:r>
-      <w:r>
-        <w:rPr>
-          <w:rFonts w:ascii="Courier New" w:hAnsi="Courier New"/>
-          <w:sz w:val="20"/>
-        </w:rPr>
-        <w:br/>
-        <w:t>x2 = 0</w:t>
-      </w:r>
-      <w:r>
-        <w:rPr>
-          <w:rFonts w:ascii="Courier New" w:hAnsi="Courier New"/>
-          <w:sz w:val="20"/>
-        </w:rPr>
-        <w:br/>
-        <w:t>x3 = 0</w:t>
-      </w:r>
-      <w:r>
-        <w:rPr>
-          <w:rFonts w:ascii="Courier New" w:hAnsi="Courier New"/>
-          <w:sz w:val="20"/>
-        </w:rPr>
-        <w:br/>
-        <w:t>x10 = 10</w:t>
+      </w:pPr>
+      <w:r>
+        <w:rPr>
+          <w:b/>
+          <w:rtl/>
+        </w:rPr>
+        <w:t>نتیجه:</w:t>
       </w:r>
     </w:p>
     <w:p>
       <w:pPr>
         <w:bidi/>
         <w:jc w:val="right"/>
-        <w:rPr>
-          <w:b/>
-          <w:rtl/>
-        </w:rPr>
-      </w:pPr>
-      <w:r>
-        <w:rPr>
-          <w:b/>
-          <w:rtl/>
-        </w:rPr>
-        <w:t>نتیجه:</w:t>
-      </w:r>
-    </w:p>
-    <w:p>
-      <w:pPr>
-        <w:bidi/>
-        <w:jc w:val="right"/>
-      </w:pPr>
-      <w:r>
+      </w:pPr>
+      <w:r>
+        <w:rPr>
+          <w:noProof/>
+        </w:rPr>
         <w:drawing>
           <wp:inline distT="0" distB="0" distL="0" distR="0" wp14:anchorId="00E6824D" wp14:editId="15C579F8">
             <wp:extent cx="5486400" cy="3475990"/>
@@ -3535,7 +3515,6 @@
     <w:p>
       <w:pPr>
         <w:bidi/>
-        <w:jc w:val="right"/>
       </w:pPr>
       <w:r>
         <w:rPr>
@@ -3548,7 +3527,6 @@
       <w:pPr>
         <w:pStyle w:val="Heading2"/>
         <w:bidi/>
-        <w:jc w:val="right"/>
       </w:pPr>
       <w:r>
         <w:rPr>
@@ -3561,7 +3539,6 @@
     <w:p>
       <w:pPr>
         <w:bidi/>
-        <w:jc w:val="right"/>
       </w:pPr>
       <w:r>
         <w:rPr>
@@ -3574,13 +3551,195 @@
     <w:p>
       <w:pPr>
         <w:bidi/>
-        <w:jc w:val="right"/>
       </w:pPr>
       <w:r>
         <w:rPr>
           <w:rtl/>
         </w:rPr>
         <w:t>بررسی عملکرد واحد کنترل در اجرای چند دستور JAL متوالی و به‌روزرسانی صحیح مقدار PC در هر پرش.</w:t>
+      </w:r>
+    </w:p>
+    <w:p>
+      <w:pPr>
+        <w:bidi/>
+      </w:pPr>
+      <w:r>
+        <w:rPr>
+          <w:b/>
+          <w:rtl/>
+        </w:rPr>
+        <w:t>نمونه کد:</w:t>
+      </w:r>
+    </w:p>
+    <w:p>
+      <w:r>
+        <w:rPr>
+          <w:rFonts w:ascii="Courier New" w:hAnsi="Courier New"/>
+          <w:sz w:val="20"/>
+        </w:rPr>
+        <w:t>.global _boot</w:t>
+      </w:r>
+      <w:r>
+        <w:rPr>
+          <w:rFonts w:ascii="Courier New" w:hAnsi="Courier New"/>
+          <w:sz w:val="20"/>
+        </w:rPr>
+        <w:br/>
+        <w:t>.text</w:t>
+      </w:r>
+      <w:r>
+        <w:rPr>
+          <w:rFonts w:ascii="Courier New" w:hAnsi="Courier New"/>
+          <w:sz w:val="20"/>
+        </w:rPr>
+        <w:br/>
+      </w:r>
+      <w:r>
+        <w:rPr>
+          <w:rFonts w:ascii="Courier New" w:hAnsi="Courier New"/>
+          <w:sz w:val="20"/>
+        </w:rPr>
+        <w:lastRenderedPageBreak/>
+        <w:t>.option norvc</w:t>
+      </w:r>
+      <w:r>
+        <w:rPr>
+          <w:rFonts w:ascii="Courier New" w:hAnsi="Courier New"/>
+          <w:sz w:val="20"/>
+        </w:rPr>
+        <w:br/>
+      </w:r>
+      <w:r>
+        <w:rPr>
+          <w:rFonts w:ascii="Courier New" w:hAnsi="Courier New"/>
+          <w:sz w:val="20"/>
+        </w:rPr>
+        <w:br/>
+        <w:t>_boot:</w:t>
+      </w:r>
+      <w:r>
+        <w:rPr>
+          <w:rFonts w:ascii="Courier New" w:hAnsi="Courier New"/>
+          <w:sz w:val="20"/>
+        </w:rPr>
+        <w:br/>
+        <w:t xml:space="preserve">    addi x1, x0, 1</w:t>
+      </w:r>
+      <w:r>
+        <w:rPr>
+          <w:rFonts w:ascii="Courier New" w:hAnsi="Courier New"/>
+          <w:sz w:val="20"/>
+        </w:rPr>
+        <w:br/>
+        <w:t xml:space="preserve">    jal x0, L1</w:t>
+      </w:r>
+      <w:r>
+        <w:rPr>
+          <w:rFonts w:ascii="Courier New" w:hAnsi="Courier New"/>
+          <w:sz w:val="20"/>
+        </w:rPr>
+        <w:br/>
+      </w:r>
+      <w:r>
+        <w:rPr>
+          <w:rFonts w:ascii="Courier New" w:hAnsi="Courier New"/>
+          <w:sz w:val="20"/>
+        </w:rPr>
+        <w:br/>
+        <w:t>L1:</w:t>
+      </w:r>
+      <w:r>
+        <w:rPr>
+          <w:rFonts w:ascii="Courier New" w:hAnsi="Courier New"/>
+          <w:sz w:val="20"/>
+        </w:rPr>
+        <w:br/>
+        <w:t xml:space="preserve">    addi x2, x0, 2</w:t>
+      </w:r>
+      <w:r>
+        <w:rPr>
+          <w:rFonts w:ascii="Courier New" w:hAnsi="Courier New"/>
+          <w:sz w:val="20"/>
+        </w:rPr>
+        <w:br/>
+        <w:t xml:space="preserve">    jal x0, L2</w:t>
+      </w:r>
+      <w:r>
+        <w:rPr>
+          <w:rFonts w:ascii="Courier New" w:hAnsi="Courier New"/>
+          <w:sz w:val="20"/>
+        </w:rPr>
+        <w:br/>
+      </w:r>
+      <w:r>
+        <w:rPr>
+          <w:rFonts w:ascii="Courier New" w:hAnsi="Courier New"/>
+          <w:sz w:val="20"/>
+        </w:rPr>
+        <w:br/>
+        <w:t>L2:</w:t>
+      </w:r>
+      <w:r>
+        <w:rPr>
+          <w:rFonts w:ascii="Courier New" w:hAnsi="Courier New"/>
+          <w:sz w:val="20"/>
+        </w:rPr>
+        <w:br/>
+        <w:t xml:space="preserve">    addi x3, x0, 3</w:t>
+      </w:r>
+      <w:r>
+        <w:rPr>
+          <w:rFonts w:ascii="Courier New" w:hAnsi="Courier New"/>
+          <w:sz w:val="20"/>
+        </w:rPr>
+        <w:br/>
+        <w:t xml:space="preserve">    jal x0, L3</w:t>
+      </w:r>
+      <w:r>
+        <w:rPr>
+          <w:rFonts w:ascii="Courier New" w:hAnsi="Courier New"/>
+          <w:sz w:val="20"/>
+        </w:rPr>
+        <w:br/>
+      </w:r>
+      <w:r>
+        <w:rPr>
+          <w:rFonts w:ascii="Courier New" w:hAnsi="Courier New"/>
+          <w:sz w:val="20"/>
+        </w:rPr>
+        <w:br/>
+        <w:t>L3:</w:t>
+      </w:r>
+      <w:r>
+        <w:rPr>
+          <w:rFonts w:ascii="Courier New" w:hAnsi="Courier New"/>
+          <w:sz w:val="20"/>
+        </w:rPr>
+        <w:br/>
+        <w:t xml:space="preserve">    addi x4, x0, 4</w:t>
+      </w:r>
+      <w:r>
+        <w:rPr>
+          <w:rFonts w:ascii="Courier New" w:hAnsi="Courier New"/>
+          <w:sz w:val="20"/>
+        </w:rPr>
+        <w:br/>
+      </w:r>
+      <w:r>
+        <w:rPr>
+          <w:rFonts w:ascii="Courier New" w:hAnsi="Courier New"/>
+          <w:sz w:val="20"/>
+        </w:rPr>
+        <w:br/>
+        <w:t>END:</w:t>
+      </w:r>
+      <w:r>
+        <w:rPr>
+          <w:rFonts w:ascii="Courier New" w:hAnsi="Courier New"/>
+          <w:sz w:val="20"/>
+        </w:rPr>
+        <w:br/>
+        <w:t xml:space="preserve">    beq x0, x0, END</w:t>
       </w:r>
     </w:p>
     <w:p>
@@ -3593,7 +3752,7 @@
           <w:b/>
           <w:rtl/>
         </w:rPr>
-        <w:t>نمونه کد:</w:t>
+        <w:t>نتیجه مورد انتظار:</w:t>
       </w:r>
     </w:p>
     <w:p>
@@ -3602,7 +3761,7 @@
           <w:rFonts w:ascii="Courier New" w:hAnsi="Courier New"/>
           <w:sz w:val="20"/>
         </w:rPr>
-        <w:t>.global _boot</w:t>
+        <w:t>x1 = 1</w:t>
       </w:r>
       <w:r>
         <w:rPr>
@@ -3610,7 +3769,7 @@
           <w:sz w:val="20"/>
         </w:rPr>
         <w:br/>
-        <w:t>.text</w:t>
+        <w:t>x2 = 2</w:t>
       </w:r>
       <w:r>
         <w:rPr>
@@ -3618,224 +3777,43 @@
           <w:sz w:val="20"/>
         </w:rPr>
         <w:br/>
+        <w:t>x3 = 3</w:t>
       </w:r>
       <w:r>
         <w:rPr>
           <w:rFonts w:ascii="Courier New" w:hAnsi="Courier New"/>
           <w:sz w:val="20"/>
         </w:rPr>
-        <w:lastRenderedPageBreak/>
-        <w:t>.option norvc</w:t>
-      </w:r>
-      <w:r>
-        <w:rPr>
-          <w:rFonts w:ascii="Courier New" w:hAnsi="Courier New"/>
-          <w:sz w:val="20"/>
-        </w:rPr>
         <w:br/>
-      </w:r>
-      <w:r>
-        <w:rPr>
-          <w:rFonts w:ascii="Courier New" w:hAnsi="Courier New"/>
-          <w:sz w:val="20"/>
-        </w:rPr>
-        <w:br/>
-        <w:t>_boot:</w:t>
-      </w:r>
-      <w:r>
-        <w:rPr>
-          <w:rFonts w:ascii="Courier New" w:hAnsi="Courier New"/>
-          <w:sz w:val="20"/>
-        </w:rPr>
-        <w:br/>
-        <w:t xml:space="preserve">    addi x1, x0, 1</w:t>
-      </w:r>
-      <w:r>
-        <w:rPr>
-          <w:rFonts w:ascii="Courier New" w:hAnsi="Courier New"/>
-          <w:sz w:val="20"/>
-        </w:rPr>
-        <w:br/>
-        <w:t xml:space="preserve">    jal x0, L1</w:t>
-      </w:r>
-      <w:r>
-        <w:rPr>
-          <w:rFonts w:ascii="Courier New" w:hAnsi="Courier New"/>
-          <w:sz w:val="20"/>
-        </w:rPr>
-        <w:br/>
-      </w:r>
-      <w:r>
-        <w:rPr>
-          <w:rFonts w:ascii="Courier New" w:hAnsi="Courier New"/>
-          <w:sz w:val="20"/>
-        </w:rPr>
-        <w:br/>
-        <w:t>L1:</w:t>
-      </w:r>
-      <w:r>
-        <w:rPr>
-          <w:rFonts w:ascii="Courier New" w:hAnsi="Courier New"/>
-          <w:sz w:val="20"/>
-        </w:rPr>
-        <w:br/>
-        <w:t xml:space="preserve">    addi x2, x0, 2</w:t>
-      </w:r>
-      <w:r>
-        <w:rPr>
-          <w:rFonts w:ascii="Courier New" w:hAnsi="Courier New"/>
-          <w:sz w:val="20"/>
-        </w:rPr>
-        <w:br/>
-        <w:t xml:space="preserve">    jal x0, L2</w:t>
-      </w:r>
-      <w:r>
-        <w:rPr>
-          <w:rFonts w:ascii="Courier New" w:hAnsi="Courier New"/>
-          <w:sz w:val="20"/>
-        </w:rPr>
-        <w:br/>
-      </w:r>
-      <w:r>
-        <w:rPr>
-          <w:rFonts w:ascii="Courier New" w:hAnsi="Courier New"/>
-          <w:sz w:val="20"/>
-        </w:rPr>
-        <w:br/>
-        <w:t>L2:</w:t>
-      </w:r>
-      <w:r>
-        <w:rPr>
-          <w:rFonts w:ascii="Courier New" w:hAnsi="Courier New"/>
-          <w:sz w:val="20"/>
-        </w:rPr>
-        <w:br/>
-        <w:t xml:space="preserve">    addi x3, x0, 3</w:t>
-      </w:r>
-      <w:r>
-        <w:rPr>
-          <w:rFonts w:ascii="Courier New" w:hAnsi="Courier New"/>
-          <w:sz w:val="20"/>
-        </w:rPr>
-        <w:br/>
-        <w:t xml:space="preserve">    jal x0, L3</w:t>
-      </w:r>
-      <w:r>
-        <w:rPr>
-          <w:rFonts w:ascii="Courier New" w:hAnsi="Courier New"/>
-          <w:sz w:val="20"/>
-        </w:rPr>
-        <w:br/>
-      </w:r>
-      <w:r>
-        <w:rPr>
-          <w:rFonts w:ascii="Courier New" w:hAnsi="Courier New"/>
-          <w:sz w:val="20"/>
-        </w:rPr>
-        <w:br/>
-        <w:t>L3:</w:t>
-      </w:r>
-      <w:r>
-        <w:rPr>
-          <w:rFonts w:ascii="Courier New" w:hAnsi="Courier New"/>
-          <w:sz w:val="20"/>
-        </w:rPr>
-        <w:br/>
-        <w:t xml:space="preserve">    addi x4, x0, 4</w:t>
-      </w:r>
-      <w:r>
-        <w:rPr>
-          <w:rFonts w:ascii="Courier New" w:hAnsi="Courier New"/>
-          <w:sz w:val="20"/>
-        </w:rPr>
-        <w:br/>
-      </w:r>
-      <w:r>
-        <w:rPr>
-          <w:rFonts w:ascii="Courier New" w:hAnsi="Courier New"/>
-          <w:sz w:val="20"/>
-        </w:rPr>
-        <w:br/>
-        <w:t>END:</w:t>
-      </w:r>
-      <w:r>
-        <w:rPr>
-          <w:rFonts w:ascii="Courier New" w:hAnsi="Courier New"/>
-          <w:sz w:val="20"/>
-        </w:rPr>
-        <w:br/>
-        <w:t xml:space="preserve">    beq x0, x0, END</w:t>
+        <w:t>x4 = 4</w:t>
       </w:r>
     </w:p>
     <w:p>
       <w:pPr>
         <w:bidi/>
         <w:jc w:val="right"/>
-      </w:pPr>
-      <w:r>
         <w:rPr>
           <w:b/>
           <w:rtl/>
         </w:rPr>
-        <w:t>نتیجه مورد انتظار:</w:t>
-      </w:r>
-    </w:p>
-    <w:p>
-      <w:r>
-        <w:rPr>
-          <w:rFonts w:ascii="Courier New" w:hAnsi="Courier New"/>
-          <w:sz w:val="20"/>
-        </w:rPr>
-        <w:t>x1 = 1</w:t>
-      </w:r>
-      <w:r>
-        <w:rPr>
-          <w:rFonts w:ascii="Courier New" w:hAnsi="Courier New"/>
-          <w:sz w:val="20"/>
-        </w:rPr>
-        <w:br/>
-        <w:t>x2 = 2</w:t>
-      </w:r>
-      <w:r>
-        <w:rPr>
-          <w:rFonts w:ascii="Courier New" w:hAnsi="Courier New"/>
-          <w:sz w:val="20"/>
-        </w:rPr>
-        <w:br/>
-        <w:t>x3 = 3</w:t>
-      </w:r>
-      <w:r>
-        <w:rPr>
-          <w:rFonts w:ascii="Courier New" w:hAnsi="Courier New"/>
-          <w:sz w:val="20"/>
-        </w:rPr>
-        <w:br/>
-        <w:t>x4 = 4</w:t>
+      </w:pPr>
+      <w:r>
+        <w:rPr>
+          <w:b/>
+          <w:rtl/>
+        </w:rPr>
+        <w:t>نتیجه:</w:t>
       </w:r>
     </w:p>
     <w:p>
       <w:pPr>
         <w:bidi/>
         <w:jc w:val="right"/>
-        <w:rPr>
-          <w:b/>
-          <w:rtl/>
-        </w:rPr>
-      </w:pPr>
-      <w:r>
-        <w:rPr>
-          <w:b/>
-          <w:rtl/>
-        </w:rPr>
-        <w:t>نتیجه:</w:t>
-      </w:r>
-    </w:p>
-    <w:p>
-      <w:pPr>
-        <w:bidi/>
-        <w:jc w:val="right"/>
-      </w:pPr>
-      <w:r>
+      </w:pPr>
+      <w:r>
+        <w:rPr>
+          <w:noProof/>
+        </w:rPr>
         <w:drawing>
           <wp:inline distT="0" distB="0" distL="0" distR="0" wp14:anchorId="05570EB9" wp14:editId="47B257D6">
             <wp:extent cx="5135880" cy="3369232"/>
@@ -3895,7 +3873,6 @@
     <w:p>
       <w:pPr>
         <w:bidi/>
-        <w:jc w:val="right"/>
       </w:pPr>
       <w:r>
         <w:rPr>
@@ -3908,7 +3885,6 @@
       <w:pPr>
         <w:pStyle w:val="Heading2"/>
         <w:bidi/>
-        <w:jc w:val="right"/>
       </w:pPr>
       <w:r>
         <w:rPr>
@@ -3921,7 +3897,6 @@
     <w:p>
       <w:pPr>
         <w:bidi/>
-        <w:jc w:val="right"/>
       </w:pPr>
       <w:r>
         <w:rPr>
@@ -3934,7 +3909,6 @@
     <w:p>
       <w:pPr>
         <w:bidi/>
-        <w:jc w:val="right"/>
       </w:pPr>
       <w:r>
         <w:rPr>
@@ -3946,7 +3920,6 @@
     <w:p>
       <w:pPr>
         <w:bidi/>
-        <w:jc w:val="right"/>
       </w:pPr>
       <w:r>
         <w:rPr>
@@ -4308,7 +4281,6 @@
     <w:p>
       <w:pPr>
         <w:bidi/>
-        <w:jc w:val="right"/>
         <w:rPr>
           <w:rtl/>
         </w:rPr>
@@ -4317,7 +4289,6 @@
     <w:p>
       <w:pPr>
         <w:bidi/>
-        <w:jc w:val="right"/>
       </w:pPr>
       <w:r>
         <w:rPr>
@@ -4330,7 +4301,6 @@
       <w:pPr>
         <w:pStyle w:val="Heading1"/>
         <w:bidi/>
-        <w:jc w:val="right"/>
       </w:pPr>
       <w:r>
         <w:rPr>
@@ -4343,7 +4313,6 @@
     <w:p>
       <w:pPr>
         <w:bidi/>
-        <w:jc w:val="right"/>
       </w:pPr>
       <w:r>
         <w:rPr>
@@ -4355,7 +4324,6 @@
     <w:p>
       <w:pPr>
         <w:bidi/>
-        <w:jc w:val="right"/>
       </w:pPr>
       <w:r>
         <w:rPr>
@@ -4367,7 +4335,6 @@
     <w:p>
       <w:pPr>
         <w:bidi/>
-        <w:jc w:val="right"/>
       </w:pPr>
       <w:r>
         <w:rPr>
@@ -4556,6 +4523,205 @@
       </w:pPr>
       <w:rPr>
         <w:rFonts w:ascii="Symbol" w:hAnsi="Symbol" w:hint="default"/>
+      </w:rPr>
+    </w:lvl>
+  </w:abstractNum>
+  <w:abstractNum w:abstractNumId="9" w15:restartNumberingAfterBreak="0">
+    <w:nsid w:val="3C4D1BD9"/>
+    <w:multiLevelType w:val="hybridMultilevel"/>
+    <w:tmpl w:val="F6AA57F8"/>
+    <w:lvl w:ilvl="0" w:tplc="0409000F">
+      <w:start w:val="1"/>
+      <w:numFmt w:val="decimal"/>
+      <w:lvlText w:val="%1."/>
+      <w:lvlJc w:val="left"/>
+      <w:pPr>
+        <w:ind w:left="720" w:hanging="360"/>
+      </w:pPr>
+    </w:lvl>
+    <w:lvl w:ilvl="1" w:tplc="04090019" w:tentative="1">
+      <w:start w:val="1"/>
+      <w:numFmt w:val="lowerLetter"/>
+      <w:lvlText w:val="%2."/>
+      <w:lvlJc w:val="left"/>
+      <w:pPr>
+        <w:ind w:left="1440" w:hanging="360"/>
+      </w:pPr>
+    </w:lvl>
+    <w:lvl w:ilvl="2" w:tplc="0409001B" w:tentative="1">
+      <w:start w:val="1"/>
+      <w:numFmt w:val="lowerRoman"/>
+      <w:lvlText w:val="%3."/>
+      <w:lvlJc w:val="right"/>
+      <w:pPr>
+        <w:ind w:left="2160" w:hanging="180"/>
+      </w:pPr>
+    </w:lvl>
+    <w:lvl w:ilvl="3" w:tplc="0409000F" w:tentative="1">
+      <w:start w:val="1"/>
+      <w:numFmt w:val="decimal"/>
+      <w:lvlText w:val="%4."/>
+      <w:lvlJc w:val="left"/>
+      <w:pPr>
+        <w:ind w:left="2880" w:hanging="360"/>
+      </w:pPr>
+    </w:lvl>
+    <w:lvl w:ilvl="4" w:tplc="04090019" w:tentative="1">
+      <w:start w:val="1"/>
+      <w:numFmt w:val="lowerLetter"/>
+      <w:lvlText w:val="%5."/>
+      <w:lvlJc w:val="left"/>
+      <w:pPr>
+        <w:ind w:left="3600" w:hanging="360"/>
+      </w:pPr>
+    </w:lvl>
+    <w:lvl w:ilvl="5" w:tplc="0409001B" w:tentative="1">
+      <w:start w:val="1"/>
+      <w:numFmt w:val="lowerRoman"/>
+      <w:lvlText w:val="%6."/>
+      <w:lvlJc w:val="right"/>
+      <w:pPr>
+        <w:ind w:left="4320" w:hanging="180"/>
+      </w:pPr>
+    </w:lvl>
+    <w:lvl w:ilvl="6" w:tplc="0409000F" w:tentative="1">
+      <w:start w:val="1"/>
+      <w:numFmt w:val="decimal"/>
+      <w:lvlText w:val="%7."/>
+      <w:lvlJc w:val="left"/>
+      <w:pPr>
+        <w:ind w:left="5040" w:hanging="360"/>
+      </w:pPr>
+    </w:lvl>
+    <w:lvl w:ilvl="7" w:tplc="04090019" w:tentative="1">
+      <w:start w:val="1"/>
+      <w:numFmt w:val="lowerLetter"/>
+      <w:lvlText w:val="%8."/>
+      <w:lvlJc w:val="left"/>
+      <w:pPr>
+        <w:ind w:left="5760" w:hanging="360"/>
+      </w:pPr>
+    </w:lvl>
+    <w:lvl w:ilvl="8" w:tplc="0409001B" w:tentative="1">
+      <w:start w:val="1"/>
+      <w:numFmt w:val="lowerRoman"/>
+      <w:lvlText w:val="%9."/>
+      <w:lvlJc w:val="right"/>
+      <w:pPr>
+        <w:ind w:left="6480" w:hanging="180"/>
+      </w:pPr>
+    </w:lvl>
+  </w:abstractNum>
+  <w:abstractNum w:abstractNumId="10" w15:restartNumberingAfterBreak="0">
+    <w:nsid w:val="4B5F404B"/>
+    <w:multiLevelType w:val="hybridMultilevel"/>
+    <w:tmpl w:val="8A429EDE"/>
+    <w:lvl w:ilvl="0" w:tplc="04090001">
+      <w:start w:val="1"/>
+      <w:numFmt w:val="bullet"/>
+      <w:lvlText w:val=""/>
+      <w:lvlJc w:val="left"/>
+      <w:pPr>
+        <w:ind w:left="720" w:hanging="360"/>
+      </w:pPr>
+      <w:rPr>
+        <w:rFonts w:ascii="Symbol" w:hAnsi="Symbol" w:hint="default"/>
+      </w:rPr>
+    </w:lvl>
+    <w:lvl w:ilvl="1" w:tplc="04090003" w:tentative="1">
+      <w:start w:val="1"/>
+      <w:numFmt w:val="bullet"/>
+      <w:lvlText w:val="o"/>
+      <w:lvlJc w:val="left"/>
+      <w:pPr>
+        <w:ind w:left="1440" w:hanging="360"/>
+      </w:pPr>
+      <w:rPr>
+        <w:rFonts w:ascii="Courier New" w:hAnsi="Courier New" w:cs="Courier New" w:hint="default"/>
+      </w:rPr>
+    </w:lvl>
+    <w:lvl w:ilvl="2" w:tplc="04090005" w:tentative="1">
+      <w:start w:val="1"/>
+      <w:numFmt w:val="bullet"/>
+      <w:lvlText w:val=""/>
+      <w:lvlJc w:val="left"/>
+      <w:pPr>
+        <w:ind w:left="2160" w:hanging="360"/>
+      </w:pPr>
+      <w:rPr>
+        <w:rFonts w:ascii="Wingdings" w:hAnsi="Wingdings" w:hint="default"/>
+      </w:rPr>
+    </w:lvl>
+    <w:lvl w:ilvl="3" w:tplc="04090001" w:tentative="1">
+      <w:start w:val="1"/>
+      <w:numFmt w:val="bullet"/>
+      <w:lvlText w:val=""/>
+      <w:lvlJc w:val="left"/>
+      <w:pPr>
+        <w:ind w:left="2880" w:hanging="360"/>
+      </w:pPr>
+      <w:rPr>
+        <w:rFonts w:ascii="Symbol" w:hAnsi="Symbol" w:hint="default"/>
+      </w:rPr>
+    </w:lvl>
+    <w:lvl w:ilvl="4" w:tplc="04090003" w:tentative="1">
+      <w:start w:val="1"/>
+      <w:numFmt w:val="bullet"/>
+      <w:lvlText w:val="o"/>
+      <w:lvlJc w:val="left"/>
+      <w:pPr>
+        <w:ind w:left="3600" w:hanging="360"/>
+      </w:pPr>
+      <w:rPr>
+        <w:rFonts w:ascii="Courier New" w:hAnsi="Courier New" w:cs="Courier New" w:hint="default"/>
+      </w:rPr>
+    </w:lvl>
+    <w:lvl w:ilvl="5" w:tplc="04090005" w:tentative="1">
+      <w:start w:val="1"/>
+      <w:numFmt w:val="bullet"/>
+      <w:lvlText w:val=""/>
+      <w:lvlJc w:val="left"/>
+      <w:pPr>
+        <w:ind w:left="4320" w:hanging="360"/>
+      </w:pPr>
+      <w:rPr>
+        <w:rFonts w:ascii="Wingdings" w:hAnsi="Wingdings" w:hint="default"/>
+      </w:rPr>
+    </w:lvl>
+    <w:lvl w:ilvl="6" w:tplc="04090001" w:tentative="1">
+      <w:start w:val="1"/>
+      <w:numFmt w:val="bullet"/>
+      <w:lvlText w:val=""/>
+      <w:lvlJc w:val="left"/>
+      <w:pPr>
+        <w:ind w:left="5040" w:hanging="360"/>
+      </w:pPr>
+      <w:rPr>
+        <w:rFonts w:ascii="Symbol" w:hAnsi="Symbol" w:hint="default"/>
+      </w:rPr>
+    </w:lvl>
+    <w:lvl w:ilvl="7" w:tplc="04090003" w:tentative="1">
+      <w:start w:val="1"/>
+      <w:numFmt w:val="bullet"/>
+      <w:lvlText w:val="o"/>
+      <w:lvlJc w:val="left"/>
+      <w:pPr>
+        <w:ind w:left="5760" w:hanging="360"/>
+      </w:pPr>
+      <w:rPr>
+        <w:rFonts w:ascii="Courier New" w:hAnsi="Courier New" w:cs="Courier New" w:hint="default"/>
+      </w:rPr>
+    </w:lvl>
+    <w:lvl w:ilvl="8" w:tplc="04090005" w:tentative="1">
+      <w:start w:val="1"/>
+      <w:numFmt w:val="bullet"/>
+      <w:lvlText w:val=""/>
+      <w:lvlJc w:val="left"/>
+      <w:pPr>
+        <w:ind w:left="6480" w:hanging="360"/>
+      </w:pPr>
+      <w:rPr>
+        <w:rFonts w:ascii="Wingdings" w:hAnsi="Wingdings" w:hint="default"/>
       </w:rPr>
     </w:lvl>
   </w:abstractNum>
@@ -4585,6 +4751,12 @@
   </w:num>
   <w:num w:numId="9" w16cid:durableId="509948682">
     <w:abstractNumId w:val="0"/>
+  </w:num>
+  <w:num w:numId="10" w16cid:durableId="799884294">
+    <w:abstractNumId w:val="10"/>
+  </w:num>
+  <w:num w:numId="11" w16cid:durableId="1841657925">
+    <w:abstractNumId w:val="9"/>
   </w:num>
 </w:numbering>
 </file>
@@ -5195,6 +5367,7 @@
   <w:style w:type="character" w:default="1" w:styleId="DefaultParagraphFont">
     <w:name w:val="Default Paragraph Font"/>
     <w:uiPriority w:val="1"/>
+    <w:semiHidden/>
     <w:unhideWhenUsed/>
   </w:style>
   <w:style w:type="table" w:default="1" w:styleId="TableNormal">

</xml_diff>